<commit_message>
Doctor's recording list: Zafar's 13 Oct answers (old man's lines as section E, 'Say thank you', A53 to Nani, numbers 1-10 kept)
Counts: A 82, B 63, C 64, D 10, E 16 (235 lines). .docx rebuilt.

Co-Authored-By: Claude Opus 5.5 <noreply@anthropic.com>
Claude-Session: https://claude.ai/code/session_0139eunTRRBf6SDDS6AVLEkZ
</commit_message>
<xml_diff>
--- a/docs/language/doctor-recording-list.docx
+++ b/docs/language/doctor-recording-list.docx
@@ -31,7 +31,7 @@
           <w:i/>
           <w:iCs/>
         </w:rPr>
-        <w:t xml:space="preserve">The English is only the meaning. "·" means say each part, one after the other. Section D is a few questions only you can answer.</w:t>
+        <w:t xml:space="preserve">The English is only the meaning. "·" means say each part, one after the other. Section D is a few questions only you can answer; section E is the old man's lines, for when you play the patient.</w:t>
       </w:r>
     </w:p>
     <w:p>
@@ -6867,7 +6867,7 @@
                 <w:sz w:val="21"/>
                 <w:szCs w:val="21"/>
               </w:rPr>
-              <w:t xml:space="preserve">Ask them how they feel.</w:t>
+              <w:t xml:space="preserve">Say bye.</w:t>
             </w:r>
           </w:p>
         </w:tc>
@@ -6918,7 +6918,7 @@
                 <w:sz w:val="21"/>
                 <w:szCs w:val="21"/>
               </w:rPr>
-              <w:t xml:space="preserve">a whisper, level 3</w:t>
+              <w:t xml:space="preserve">the goodbye cue, level 2+</w:t>
             </w:r>
           </w:p>
         </w:tc>
@@ -6982,7 +6982,7 @@
                 <w:sz w:val="21"/>
                 <w:szCs w:val="21"/>
               </w:rPr>
-              <w:t xml:space="preserve">Say bye.</w:t>
+              <w:t xml:space="preserve">Say thank you.</w:t>
             </w:r>
           </w:p>
         </w:tc>
@@ -7006,6 +7006,22 @@
             <w:pPr>
               <w:spacing w:after="0"/>
             </w:pPr>
+            <w:r>
+              <w:rPr>
+                <w:i/>
+                <w:iCs/>
+                <w:sz w:val="21"/>
+                <w:szCs w:val="21"/>
+              </w:rPr>
+              <w:t xml:space="preserve">thank you</w:t>
+            </w:r>
+            <w:r>
+              <w:rPr>
+                <w:sz w:val="21"/>
+                <w:szCs w:val="21"/>
+              </w:rPr>
+              <w:t xml:space="preserve"> (the family says it in English)</w:t>
+            </w:r>
           </w:p>
         </w:tc>
         <w:tc>
@@ -7033,7 +7049,7 @@
                 <w:sz w:val="21"/>
                 <w:szCs w:val="21"/>
               </w:rPr>
-              <w:t xml:space="preserve">the goodbye cue, level 2+</w:t>
+              <w:t xml:space="preserve">the goodbye cue</w:t>
             </w:r>
           </w:p>
         </w:tc>
@@ -7069,121 +7085,6 @@
                 <w:szCs w:val="21"/>
               </w:rPr>
               <w:t xml:space="preserve">A55</w:t>
-            </w:r>
-          </w:p>
-        </w:tc>
-        <w:tc>
-          <w:tcPr>
-            <w:tcW w:type="dxa" w:w="3900"/>
-            <w:tcBorders>
-              <w:top w:val="single" w:color="BFA999" w:sz="4"/>
-              <w:left w:val="single" w:color="BFA999" w:sz="4"/>
-              <w:bottom w:val="single" w:color="BFA999" w:sz="4"/>
-              <w:right w:val="single" w:color="BFA999" w:sz="4"/>
-            </w:tcBorders>
-            <w:tcMar>
-              <w:top w:type="dxa" w:w="60"/>
-              <w:left w:type="dxa" w:w="100"/>
-              <w:bottom w:type="dxa" w:w="60"/>
-              <w:right w:type="dxa" w:w="100"/>
-            </w:tcMar>
-          </w:tcPr>
-          <w:p>
-            <w:pPr>
-              <w:spacing w:after="0"/>
-            </w:pPr>
-            <w:r>
-              <w:rPr>
-                <w:sz w:val="21"/>
-                <w:szCs w:val="21"/>
-              </w:rPr>
-              <w:t xml:space="preserve">Say thank you to the doctor.</w:t>
-            </w:r>
-          </w:p>
-        </w:tc>
-        <w:tc>
-          <w:tcPr>
-            <w:tcW w:type="dxa" w:w="2900"/>
-            <w:tcBorders>
-              <w:top w:val="single" w:color="BFA999" w:sz="4"/>
-              <w:left w:val="single" w:color="BFA999" w:sz="4"/>
-              <w:bottom w:val="single" w:color="BFA999" w:sz="4"/>
-              <w:right w:val="single" w:color="BFA999" w:sz="4"/>
-            </w:tcBorders>
-            <w:tcMar>
-              <w:top w:type="dxa" w:w="60"/>
-              <w:left w:type="dxa" w:w="100"/>
-              <w:bottom w:type="dxa" w:w="60"/>
-              <w:right w:type="dxa" w:w="100"/>
-            </w:tcMar>
-          </w:tcPr>
-          <w:p>
-            <w:pPr>
-              <w:spacing w:after="0"/>
-            </w:pPr>
-          </w:p>
-        </w:tc>
-        <w:tc>
-          <w:tcPr>
-            <w:tcW w:type="dxa" w:w="1988"/>
-            <w:tcBorders>
-              <w:top w:val="single" w:color="BFA999" w:sz="4"/>
-              <w:left w:val="single" w:color="BFA999" w:sz="4"/>
-              <w:bottom w:val="single" w:color="BFA999" w:sz="4"/>
-              <w:right w:val="single" w:color="BFA999" w:sz="4"/>
-            </w:tcBorders>
-            <w:tcMar>
-              <w:top w:type="dxa" w:w="60"/>
-              <w:left w:type="dxa" w:w="100"/>
-              <w:bottom w:type="dxa" w:w="60"/>
-              <w:right w:type="dxa" w:w="100"/>
-            </w:tcMar>
-          </w:tcPr>
-          <w:p>
-            <w:pPr>
-              <w:spacing w:after="0"/>
-            </w:pPr>
-            <w:r>
-              <w:rPr>
-                <w:sz w:val="21"/>
-                <w:szCs w:val="21"/>
-              </w:rPr>
-              <w:t xml:space="preserve">the goodbye cue</w:t>
-            </w:r>
-          </w:p>
-        </w:tc>
-      </w:tr>
-      <w:tr>
-        <w:trPr>
-          <w:cantSplit/>
-          <w:tblHeader w:val="false"/>
-        </w:trPr>
-        <w:tc>
-          <w:tcPr>
-            <w:tcW w:type="dxa" w:w="850"/>
-            <w:tcBorders>
-              <w:top w:val="single" w:color="BFA999" w:sz="4"/>
-              <w:left w:val="single" w:color="BFA999" w:sz="4"/>
-              <w:bottom w:val="single" w:color="BFA999" w:sz="4"/>
-              <w:right w:val="single" w:color="BFA999" w:sz="4"/>
-            </w:tcBorders>
-            <w:tcMar>
-              <w:top w:type="dxa" w:w="60"/>
-              <w:left w:type="dxa" w:w="100"/>
-              <w:bottom w:type="dxa" w:w="60"/>
-              <w:right w:type="dxa" w:w="100"/>
-            </w:tcMar>
-          </w:tcPr>
-          <w:p>
-            <w:pPr>
-              <w:spacing w:after="0"/>
-            </w:pPr>
-            <w:r>
-              <w:rPr>
-                <w:sz w:val="21"/>
-                <w:szCs w:val="21"/>
-              </w:rPr>
-              <w:t xml:space="preserve">A56</w:t>
             </w:r>
           </w:p>
         </w:tc>
@@ -7466,7 +7367,7 @@
                 <w:sz w:val="21"/>
                 <w:szCs w:val="21"/>
               </w:rPr>
-              <w:t xml:space="preserve">A57</w:t>
+              <w:t xml:space="preserve">A56</w:t>
             </w:r>
           </w:p>
         </w:tc>
@@ -7597,7 +7498,7 @@
                 <w:sz w:val="21"/>
                 <w:szCs w:val="21"/>
               </w:rPr>
-              <w:t xml:space="preserve">A58</w:t>
+              <w:t xml:space="preserve">A57</w:t>
             </w:r>
           </w:p>
         </w:tc>
@@ -7712,7 +7613,7 @@
                 <w:sz w:val="21"/>
                 <w:szCs w:val="21"/>
               </w:rPr>
-              <w:t xml:space="preserve">A59</w:t>
+              <w:t xml:space="preserve">A58</w:t>
             </w:r>
           </w:p>
         </w:tc>
@@ -7843,7 +7744,7 @@
                 <w:sz w:val="21"/>
                 <w:szCs w:val="21"/>
               </w:rPr>
-              <w:t xml:space="preserve">A60</w:t>
+              <w:t xml:space="preserve">A59</w:t>
             </w:r>
           </w:p>
         </w:tc>
@@ -7958,7 +7859,7 @@
                 <w:sz w:val="21"/>
                 <w:szCs w:val="21"/>
               </w:rPr>
-              <w:t xml:space="preserve">A61</w:t>
+              <w:t xml:space="preserve">A60</w:t>
             </w:r>
           </w:p>
         </w:tc>
@@ -8073,7 +7974,7 @@
                 <w:sz w:val="21"/>
                 <w:szCs w:val="21"/>
               </w:rPr>
-              <w:t xml:space="preserve">A62</w:t>
+              <w:t xml:space="preserve">A61</w:t>
             </w:r>
           </w:p>
         </w:tc>
@@ -8188,7 +8089,7 @@
                 <w:sz w:val="21"/>
                 <w:szCs w:val="21"/>
               </w:rPr>
-              <w:t xml:space="preserve">A63</w:t>
+              <w:t xml:space="preserve">A62</w:t>
             </w:r>
           </w:p>
         </w:tc>
@@ -8303,7 +8204,7 @@
                 <w:sz w:val="21"/>
                 <w:szCs w:val="21"/>
               </w:rPr>
-              <w:t xml:space="preserve">A64</w:t>
+              <w:t xml:space="preserve">A63</w:t>
             </w:r>
           </w:p>
         </w:tc>
@@ -8418,7 +8319,7 @@
                 <w:sz w:val="21"/>
                 <w:szCs w:val="21"/>
               </w:rPr>
-              <w:t xml:space="preserve">A65</w:t>
+              <w:t xml:space="preserve">A64</w:t>
             </w:r>
           </w:p>
         </w:tc>
@@ -8549,7 +8450,7 @@
                 <w:sz w:val="21"/>
                 <w:szCs w:val="21"/>
               </w:rPr>
-              <w:t xml:space="preserve">A66</w:t>
+              <w:t xml:space="preserve">A65</w:t>
             </w:r>
           </w:p>
         </w:tc>
@@ -8664,7 +8565,7 @@
                 <w:sz w:val="21"/>
                 <w:szCs w:val="21"/>
               </w:rPr>
-              <w:t xml:space="preserve">A67</w:t>
+              <w:t xml:space="preserve">A66</w:t>
             </w:r>
           </w:p>
         </w:tc>
@@ -8779,7 +8680,7 @@
                 <w:sz w:val="21"/>
                 <w:szCs w:val="21"/>
               </w:rPr>
-              <w:t xml:space="preserve">A68</w:t>
+              <w:t xml:space="preserve">A67</w:t>
             </w:r>
           </w:p>
         </w:tc>
@@ -8894,7 +8795,7 @@
                 <w:sz w:val="21"/>
                 <w:szCs w:val="21"/>
               </w:rPr>
-              <w:t xml:space="preserve">A69</w:t>
+              <w:t xml:space="preserve">A68</w:t>
             </w:r>
           </w:p>
         </w:tc>
@@ -9025,7 +8926,7 @@
                 <w:sz w:val="21"/>
                 <w:szCs w:val="21"/>
               </w:rPr>
-              <w:t xml:space="preserve">A70</w:t>
+              <w:t xml:space="preserve">A69</w:t>
             </w:r>
           </w:p>
         </w:tc>
@@ -9140,7 +9041,7 @@
                 <w:sz w:val="21"/>
                 <w:szCs w:val="21"/>
               </w:rPr>
-              <w:t xml:space="preserve">A71</w:t>
+              <w:t xml:space="preserve">A70</w:t>
             </w:r>
           </w:p>
         </w:tc>
@@ -9255,7 +9156,7 @@
                 <w:sz w:val="21"/>
                 <w:szCs w:val="21"/>
               </w:rPr>
-              <w:t xml:space="preserve">A72</w:t>
+              <w:t xml:space="preserve">A71</w:t>
             </w:r>
           </w:p>
         </w:tc>
@@ -9418,7 +9319,7 @@
                 <w:sz w:val="21"/>
                 <w:szCs w:val="21"/>
               </w:rPr>
-              <w:t xml:space="preserve">A73</w:t>
+              <w:t xml:space="preserve">A72</w:t>
             </w:r>
           </w:p>
         </w:tc>
@@ -9597,7 +9498,7 @@
                 <w:sz w:val="21"/>
                 <w:szCs w:val="21"/>
               </w:rPr>
-              <w:t xml:space="preserve">A74</w:t>
+              <w:t xml:space="preserve">A73</w:t>
             </w:r>
           </w:p>
         </w:tc>
@@ -9744,7 +9645,7 @@
                 <w:sz w:val="21"/>
                 <w:szCs w:val="21"/>
               </w:rPr>
-              <w:t xml:space="preserve">A75</w:t>
+              <w:t xml:space="preserve">A74</w:t>
             </w:r>
           </w:p>
         </w:tc>
@@ -9875,7 +9776,7 @@
                 <w:sz w:val="21"/>
                 <w:szCs w:val="21"/>
               </w:rPr>
-              <w:t xml:space="preserve">A76</w:t>
+              <w:t xml:space="preserve">A75</w:t>
             </w:r>
           </w:p>
         </w:tc>
@@ -9990,7 +9891,7 @@
                 <w:sz w:val="21"/>
                 <w:szCs w:val="21"/>
               </w:rPr>
-              <w:t xml:space="preserve">A77</w:t>
+              <w:t xml:space="preserve">A76</w:t>
             </w:r>
           </w:p>
         </w:tc>
@@ -10105,7 +10006,7 @@
                 <w:sz w:val="21"/>
                 <w:szCs w:val="21"/>
               </w:rPr>
-              <w:t xml:space="preserve">A78</w:t>
+              <w:t xml:space="preserve">A77</w:t>
             </w:r>
           </w:p>
         </w:tc>
@@ -10220,7 +10121,7 @@
                 <w:sz w:val="21"/>
                 <w:szCs w:val="21"/>
               </w:rPr>
-              <w:t xml:space="preserve">A79</w:t>
+              <w:t xml:space="preserve">A78</w:t>
             </w:r>
           </w:p>
         </w:tc>
@@ -10335,7 +10236,7 @@
                 <w:sz w:val="21"/>
                 <w:szCs w:val="21"/>
               </w:rPr>
-              <w:t xml:space="preserve">A80</w:t>
+              <w:t xml:space="preserve">A79</w:t>
             </w:r>
           </w:p>
         </w:tc>
@@ -10482,7 +10383,7 @@
                 <w:sz w:val="21"/>
                 <w:szCs w:val="21"/>
               </w:rPr>
-              <w:t xml:space="preserve">A81</w:t>
+              <w:t xml:space="preserve">A80</w:t>
             </w:r>
           </w:p>
         </w:tc>
@@ -10613,7 +10514,7 @@
                 <w:sz w:val="21"/>
                 <w:szCs w:val="21"/>
               </w:rPr>
-              <w:t xml:space="preserve">A82</w:t>
+              <w:t xml:space="preserve">A81</w:t>
             </w:r>
           </w:p>
         </w:tc>
@@ -10728,7 +10629,7 @@
                 <w:sz w:val="21"/>
                 <w:szCs w:val="21"/>
               </w:rPr>
-              <w:t xml:space="preserve">A83</w:t>
+              <w:t xml:space="preserve">A82</w:t>
             </w:r>
           </w:p>
         </w:tc>
@@ -11672,7 +11573,7 @@
                 <w:sz w:val="21"/>
                 <w:szCs w:val="21"/>
               </w:rPr>
-              <w:t xml:space="preserve">step 3, level 3</w:t>
+              <w:t xml:space="preserve">step 3, the harder levels</w:t>
             </w:r>
           </w:p>
         </w:tc>
@@ -29892,6 +29793,2142 @@
         <w:pStyle w:val="Heading2"/>
       </w:pPr>
       <w:r>
+        <w:t xml:space="preserve">E. The old man's lines (when you play the patient)</w:t>
+      </w:r>
+    </w:p>
+    <w:p>
+      <w:r>
+        <w:rPr>
+          <w:i/>
+          <w:iCs/>
+        </w:rPr>
+        <w:t xml:space="preserve">The patient's lines, for the old man who comes to the clinic (decision 66). Say them as a poorly grandad would.</w:t>
+      </w:r>
+    </w:p>
+    <w:tbl>
+      <w:tblPr>
+        <w:tblW w:type="dxa" w:w="9638"/>
+        <w:tblBorders>
+          <w:top w:val="single" w:color="auto" w:sz="4"/>
+          <w:left w:val="single" w:color="auto" w:sz="4"/>
+          <w:bottom w:val="single" w:color="auto" w:sz="4"/>
+          <w:right w:val="single" w:color="auto" w:sz="4"/>
+          <w:insideH w:val="single" w:color="auto" w:sz="4"/>
+          <w:insideV w:val="single" w:color="auto" w:sz="4"/>
+        </w:tblBorders>
+        <w:tblLayout w:type="fixed"/>
+      </w:tblPr>
+      <w:tblGrid>
+        <w:gridCol w:w="850"/>
+        <w:gridCol w:w="3900"/>
+        <w:gridCol w:w="2900"/>
+        <w:gridCol w:w="1988"/>
+      </w:tblGrid>
+      <w:tr>
+        <w:trPr>
+          <w:cantSplit/>
+          <w:tblHeader/>
+        </w:trPr>
+        <w:tc>
+          <w:tcPr>
+            <w:tcW w:type="dxa" w:w="850"/>
+            <w:tcBorders>
+              <w:top w:val="single" w:color="BFA999" w:sz="4"/>
+              <w:left w:val="single" w:color="BFA999" w:sz="4"/>
+              <w:bottom w:val="single" w:color="BFA999" w:sz="4"/>
+              <w:right w:val="single" w:color="BFA999" w:sz="4"/>
+            </w:tcBorders>
+            <w:shd w:fill="F3E6DA" w:color="auto" w:val="clear"/>
+            <w:tcMar>
+              <w:top w:type="dxa" w:w="60"/>
+              <w:left w:type="dxa" w:w="100"/>
+              <w:bottom w:type="dxa" w:w="60"/>
+              <w:right w:type="dxa" w:w="100"/>
+            </w:tcMar>
+          </w:tcPr>
+          <w:p>
+            <w:pPr>
+              <w:spacing w:after="0"/>
+            </w:pPr>
+            <w:r>
+              <w:rPr>
+                <w:b/>
+                <w:bCs/>
+                <w:sz w:val="20"/>
+                <w:szCs w:val="20"/>
+              </w:rPr>
+              <w:t xml:space="preserve">ID</w:t>
+            </w:r>
+          </w:p>
+        </w:tc>
+        <w:tc>
+          <w:tcPr>
+            <w:tcW w:type="dxa" w:w="3900"/>
+            <w:tcBorders>
+              <w:top w:val="single" w:color="BFA999" w:sz="4"/>
+              <w:left w:val="single" w:color="BFA999" w:sz="4"/>
+              <w:bottom w:val="single" w:color="BFA999" w:sz="4"/>
+              <w:right w:val="single" w:color="BFA999" w:sz="4"/>
+            </w:tcBorders>
+            <w:shd w:fill="F3E6DA" w:color="auto" w:val="clear"/>
+            <w:tcMar>
+              <w:top w:type="dxa" w:w="60"/>
+              <w:left w:type="dxa" w:w="100"/>
+              <w:bottom w:type="dxa" w:w="60"/>
+              <w:right w:type="dxa" w:w="100"/>
+            </w:tcMar>
+          </w:tcPr>
+          <w:p>
+            <w:pPr>
+              <w:spacing w:after="0"/>
+            </w:pPr>
+            <w:r>
+              <w:rPr>
+                <w:b/>
+                <w:bCs/>
+                <w:sz w:val="20"/>
+                <w:szCs w:val="20"/>
+              </w:rPr>
+              <w:t xml:space="preserve">English meaning</w:t>
+            </w:r>
+          </w:p>
+        </w:tc>
+        <w:tc>
+          <w:tcPr>
+            <w:tcW w:type="dxa" w:w="2900"/>
+            <w:tcBorders>
+              <w:top w:val="single" w:color="BFA999" w:sz="4"/>
+              <w:left w:val="single" w:color="BFA999" w:sz="4"/>
+              <w:bottom w:val="single" w:color="BFA999" w:sz="4"/>
+              <w:right w:val="single" w:color="BFA999" w:sz="4"/>
+            </w:tcBorders>
+            <w:shd w:fill="F3E6DA" w:color="auto" w:val="clear"/>
+            <w:tcMar>
+              <w:top w:type="dxa" w:w="60"/>
+              <w:left w:type="dxa" w:w="100"/>
+              <w:bottom w:type="dxa" w:w="60"/>
+              <w:right w:type="dxa" w:w="100"/>
+            </w:tcMar>
+          </w:tcPr>
+          <w:p>
+            <w:pPr>
+              <w:spacing w:after="0"/>
+            </w:pPr>
+            <w:r>
+              <w:rPr>
+                <w:b/>
+                <w:bCs/>
+                <w:sz w:val="20"/>
+                <w:szCs w:val="20"/>
+              </w:rPr>
+              <w:t xml:space="preserve">Mum's Kutchi (say it your own way)</w:t>
+            </w:r>
+          </w:p>
+        </w:tc>
+        <w:tc>
+          <w:tcPr>
+            <w:tcW w:type="dxa" w:w="1988"/>
+            <w:tcBorders>
+              <w:top w:val="single" w:color="BFA999" w:sz="4"/>
+              <w:left w:val="single" w:color="BFA999" w:sz="4"/>
+              <w:bottom w:val="single" w:color="BFA999" w:sz="4"/>
+              <w:right w:val="single" w:color="BFA999" w:sz="4"/>
+            </w:tcBorders>
+            <w:shd w:fill="F3E6DA" w:color="auto" w:val="clear"/>
+            <w:tcMar>
+              <w:top w:type="dxa" w:w="60"/>
+              <w:left w:type="dxa" w:w="100"/>
+              <w:bottom w:type="dxa" w:w="60"/>
+              <w:right w:type="dxa" w:w="100"/>
+            </w:tcMar>
+          </w:tcPr>
+          <w:p>
+            <w:pPr>
+              <w:spacing w:after="0"/>
+            </w:pPr>
+            <w:r>
+              <w:rPr>
+                <w:b/>
+                <w:bCs/>
+                <w:sz w:val="20"/>
+                <w:szCs w:val="20"/>
+              </w:rPr>
+              <w:t xml:space="preserve">Where it's used</w:t>
+            </w:r>
+          </w:p>
+        </w:tc>
+      </w:tr>
+      <w:tr>
+        <w:trPr>
+          <w:cantSplit/>
+          <w:tblHeader w:val="false"/>
+        </w:trPr>
+        <w:tc>
+          <w:tcPr>
+            <w:tcW w:type="dxa" w:w="850"/>
+            <w:tcBorders>
+              <w:top w:val="single" w:color="BFA999" w:sz="4"/>
+              <w:left w:val="single" w:color="BFA999" w:sz="4"/>
+              <w:bottom w:val="single" w:color="BFA999" w:sz="4"/>
+              <w:right w:val="single" w:color="BFA999" w:sz="4"/>
+            </w:tcBorders>
+            <w:tcMar>
+              <w:top w:type="dxa" w:w="60"/>
+              <w:left w:type="dxa" w:w="100"/>
+              <w:bottom w:type="dxa" w:w="60"/>
+              <w:right w:type="dxa" w:w="100"/>
+            </w:tcMar>
+          </w:tcPr>
+          <w:p>
+            <w:pPr>
+              <w:spacing w:after="0"/>
+            </w:pPr>
+            <w:r>
+              <w:rPr>
+                <w:sz w:val="21"/>
+                <w:szCs w:val="21"/>
+              </w:rPr>
+              <w:t xml:space="preserve">E1</w:t>
+            </w:r>
+          </w:p>
+        </w:tc>
+        <w:tc>
+          <w:tcPr>
+            <w:tcW w:type="dxa" w:w="3900"/>
+            <w:tcBorders>
+              <w:top w:val="single" w:color="BFA999" w:sz="4"/>
+              <w:left w:val="single" w:color="BFA999" w:sz="4"/>
+              <w:bottom w:val="single" w:color="BFA999" w:sz="4"/>
+              <w:right w:val="single" w:color="BFA999" w:sz="4"/>
+            </w:tcBorders>
+            <w:tcMar>
+              <w:top w:type="dxa" w:w="60"/>
+              <w:left w:type="dxa" w:w="100"/>
+              <w:bottom w:type="dxa" w:w="60"/>
+              <w:right w:type="dxa" w:w="100"/>
+            </w:tcMar>
+          </w:tcPr>
+          <w:p>
+            <w:pPr>
+              <w:spacing w:after="0"/>
+            </w:pPr>
+            <w:r>
+              <w:rPr>
+                <w:sz w:val="21"/>
+                <w:szCs w:val="21"/>
+              </w:rPr>
+              <w:t xml:space="preserve">Salamun alaykum.</w:t>
+            </w:r>
+          </w:p>
+        </w:tc>
+        <w:tc>
+          <w:tcPr>
+            <w:tcW w:type="dxa" w:w="2900"/>
+            <w:tcBorders>
+              <w:top w:val="single" w:color="BFA999" w:sz="4"/>
+              <w:left w:val="single" w:color="BFA999" w:sz="4"/>
+              <w:bottom w:val="single" w:color="BFA999" w:sz="4"/>
+              <w:right w:val="single" w:color="BFA999" w:sz="4"/>
+            </w:tcBorders>
+            <w:tcMar>
+              <w:top w:type="dxa" w:w="60"/>
+              <w:left w:type="dxa" w:w="100"/>
+              <w:bottom w:type="dxa" w:w="60"/>
+              <w:right w:type="dxa" w:w="100"/>
+            </w:tcMar>
+          </w:tcPr>
+          <w:p>
+            <w:pPr>
+              <w:spacing w:after="0"/>
+            </w:pPr>
+            <w:r>
+              <w:rPr>
+                <w:sz w:val="21"/>
+                <w:szCs w:val="21"/>
+              </w:rPr>
+              <w:t xml:space="preserve">Mum: </w:t>
+            </w:r>
+            <w:r>
+              <w:rPr>
+                <w:i/>
+                <w:iCs/>
+                <w:sz w:val="21"/>
+                <w:szCs w:val="21"/>
+              </w:rPr>
+              <w:t xml:space="preserve">salamun alaykum</w:t>
+            </w:r>
+          </w:p>
+        </w:tc>
+        <w:tc>
+          <w:tcPr>
+            <w:tcW w:type="dxa" w:w="1988"/>
+            <w:tcBorders>
+              <w:top w:val="single" w:color="BFA999" w:sz="4"/>
+              <w:left w:val="single" w:color="BFA999" w:sz="4"/>
+              <w:bottom w:val="single" w:color="BFA999" w:sz="4"/>
+              <w:right w:val="single" w:color="BFA999" w:sz="4"/>
+            </w:tcBorders>
+            <w:tcMar>
+              <w:top w:type="dxa" w:w="60"/>
+              <w:left w:type="dxa" w:w="100"/>
+              <w:bottom w:type="dxa" w:w="60"/>
+              <w:right w:type="dxa" w:w="100"/>
+            </w:tcMar>
+          </w:tcPr>
+          <w:p>
+            <w:pPr>
+              <w:spacing w:after="0"/>
+            </w:pPr>
+            <w:r>
+              <w:rPr>
+                <w:sz w:val="21"/>
+                <w:szCs w:val="21"/>
+              </w:rPr>
+              <w:t xml:space="preserve">his greeting in the waiting room</w:t>
+            </w:r>
+          </w:p>
+        </w:tc>
+      </w:tr>
+      <w:tr>
+        <w:trPr>
+          <w:cantSplit/>
+          <w:tblHeader w:val="false"/>
+        </w:trPr>
+        <w:tc>
+          <w:tcPr>
+            <w:tcW w:type="dxa" w:w="850"/>
+            <w:tcBorders>
+              <w:top w:val="single" w:color="BFA999" w:sz="4"/>
+              <w:left w:val="single" w:color="BFA999" w:sz="4"/>
+              <w:bottom w:val="single" w:color="BFA999" w:sz="4"/>
+              <w:right w:val="single" w:color="BFA999" w:sz="4"/>
+            </w:tcBorders>
+            <w:tcMar>
+              <w:top w:type="dxa" w:w="60"/>
+              <w:left w:type="dxa" w:w="100"/>
+              <w:bottom w:type="dxa" w:w="60"/>
+              <w:right w:type="dxa" w:w="100"/>
+            </w:tcMar>
+          </w:tcPr>
+          <w:p>
+            <w:pPr>
+              <w:spacing w:after="0"/>
+            </w:pPr>
+            <w:r>
+              <w:rPr>
+                <w:sz w:val="21"/>
+                <w:szCs w:val="21"/>
+              </w:rPr>
+              <w:t xml:space="preserve">E2</w:t>
+            </w:r>
+          </w:p>
+        </w:tc>
+        <w:tc>
+          <w:tcPr>
+            <w:tcW w:type="dxa" w:w="3900"/>
+            <w:tcBorders>
+              <w:top w:val="single" w:color="BFA999" w:sz="4"/>
+              <w:left w:val="single" w:color="BFA999" w:sz="4"/>
+              <w:bottom w:val="single" w:color="BFA999" w:sz="4"/>
+              <w:right w:val="single" w:color="BFA999" w:sz="4"/>
+            </w:tcBorders>
+            <w:tcMar>
+              <w:top w:type="dxa" w:w="60"/>
+              <w:left w:type="dxa" w:w="100"/>
+              <w:bottom w:type="dxa" w:w="60"/>
+              <w:right w:type="dxa" w:w="100"/>
+            </w:tcMar>
+          </w:tcPr>
+          <w:p>
+            <w:pPr>
+              <w:spacing w:after="0"/>
+            </w:pPr>
+            <w:r>
+              <w:rPr>
+                <w:sz w:val="21"/>
+                <w:szCs w:val="21"/>
+              </w:rPr>
+              <w:t xml:space="preserve">My knee hurts. · My arm hurts. · My foot hurts.</w:t>
+            </w:r>
+          </w:p>
+        </w:tc>
+        <w:tc>
+          <w:tcPr>
+            <w:tcW w:type="dxa" w:w="2900"/>
+            <w:tcBorders>
+              <w:top w:val="single" w:color="BFA999" w:sz="4"/>
+              <w:left w:val="single" w:color="BFA999" w:sz="4"/>
+              <w:bottom w:val="single" w:color="BFA999" w:sz="4"/>
+              <w:right w:val="single" w:color="BFA999" w:sz="4"/>
+            </w:tcBorders>
+            <w:tcMar>
+              <w:top w:type="dxa" w:w="60"/>
+              <w:left w:type="dxa" w:w="100"/>
+              <w:bottom w:type="dxa" w:w="60"/>
+              <w:right w:type="dxa" w:w="100"/>
+            </w:tcMar>
+          </w:tcPr>
+          <w:p>
+            <w:pPr>
+              <w:spacing w:after="0"/>
+            </w:pPr>
+          </w:p>
+        </w:tc>
+        <w:tc>
+          <w:tcPr>
+            <w:tcW w:type="dxa" w:w="1988"/>
+            <w:tcBorders>
+              <w:top w:val="single" w:color="BFA999" w:sz="4"/>
+              <w:left w:val="single" w:color="BFA999" w:sz="4"/>
+              <w:bottom w:val="single" w:color="BFA999" w:sz="4"/>
+              <w:right w:val="single" w:color="BFA999" w:sz="4"/>
+            </w:tcBorders>
+            <w:tcMar>
+              <w:top w:type="dxa" w:w="60"/>
+              <w:left w:type="dxa" w:w="100"/>
+              <w:bottom w:type="dxa" w:w="60"/>
+              <w:right w:type="dxa" w:w="100"/>
+            </w:tcMar>
+          </w:tcPr>
+          <w:p>
+            <w:pPr>
+              <w:spacing w:after="0"/>
+            </w:pPr>
+            <w:r>
+              <w:rPr>
+                <w:sz w:val="21"/>
+                <w:szCs w:val="21"/>
+              </w:rPr>
+              <w:t xml:space="preserve">where it hurts (G120)</w:t>
+            </w:r>
+          </w:p>
+        </w:tc>
+      </w:tr>
+      <w:tr>
+        <w:trPr>
+          <w:cantSplit/>
+          <w:tblHeader w:val="false"/>
+        </w:trPr>
+        <w:tc>
+          <w:tcPr>
+            <w:tcW w:type="dxa" w:w="850"/>
+            <w:tcBorders>
+              <w:top w:val="single" w:color="BFA999" w:sz="4"/>
+              <w:left w:val="single" w:color="BFA999" w:sz="4"/>
+              <w:bottom w:val="single" w:color="BFA999" w:sz="4"/>
+              <w:right w:val="single" w:color="BFA999" w:sz="4"/>
+            </w:tcBorders>
+            <w:tcMar>
+              <w:top w:type="dxa" w:w="60"/>
+              <w:left w:type="dxa" w:w="100"/>
+              <w:bottom w:type="dxa" w:w="60"/>
+              <w:right w:type="dxa" w:w="100"/>
+            </w:tcMar>
+          </w:tcPr>
+          <w:p>
+            <w:pPr>
+              <w:spacing w:after="0"/>
+            </w:pPr>
+            <w:r>
+              <w:rPr>
+                <w:sz w:val="21"/>
+                <w:szCs w:val="21"/>
+              </w:rPr>
+              <w:t xml:space="preserve">E3</w:t>
+            </w:r>
+          </w:p>
+        </w:tc>
+        <w:tc>
+          <w:tcPr>
+            <w:tcW w:type="dxa" w:w="3900"/>
+            <w:tcBorders>
+              <w:top w:val="single" w:color="BFA999" w:sz="4"/>
+              <w:left w:val="single" w:color="BFA999" w:sz="4"/>
+              <w:bottom w:val="single" w:color="BFA999" w:sz="4"/>
+              <w:right w:val="single" w:color="BFA999" w:sz="4"/>
+            </w:tcBorders>
+            <w:tcMar>
+              <w:top w:type="dxa" w:w="60"/>
+              <w:left w:type="dxa" w:w="100"/>
+              <w:bottom w:type="dxa" w:w="60"/>
+              <w:right w:type="dxa" w:w="100"/>
+            </w:tcMar>
+          </w:tcPr>
+          <w:p>
+            <w:pPr>
+              <w:spacing w:after="0"/>
+            </w:pPr>
+            <w:r>
+              <w:rPr>
+                <w:sz w:val="21"/>
+                <w:szCs w:val="21"/>
+              </w:rPr>
+              <w:t xml:space="preserve">My left knee. · My right eye.</w:t>
+            </w:r>
+          </w:p>
+        </w:tc>
+        <w:tc>
+          <w:tcPr>
+            <w:tcW w:type="dxa" w:w="2900"/>
+            <w:tcBorders>
+              <w:top w:val="single" w:color="BFA999" w:sz="4"/>
+              <w:left w:val="single" w:color="BFA999" w:sz="4"/>
+              <w:bottom w:val="single" w:color="BFA999" w:sz="4"/>
+              <w:right w:val="single" w:color="BFA999" w:sz="4"/>
+            </w:tcBorders>
+            <w:tcMar>
+              <w:top w:type="dxa" w:w="60"/>
+              <w:left w:type="dxa" w:w="100"/>
+              <w:bottom w:type="dxa" w:w="60"/>
+              <w:right w:type="dxa" w:w="100"/>
+            </w:tcMar>
+          </w:tcPr>
+          <w:p>
+            <w:pPr>
+              <w:spacing w:after="0"/>
+            </w:pPr>
+            <w:r>
+              <w:rPr>
+                <w:i/>
+                <w:iCs/>
+                <w:sz w:val="21"/>
+                <w:szCs w:val="21"/>
+              </w:rPr>
+              <w:t xml:space="preserve">dabo</w:t>
+            </w:r>
+            <w:r>
+              <w:rPr>
+                <w:sz w:val="21"/>
+                <w:szCs w:val="21"/>
+              </w:rPr>
+              <w:t xml:space="preserve"> = left</w:t>
+            </w:r>
+          </w:p>
+        </w:tc>
+        <w:tc>
+          <w:tcPr>
+            <w:tcW w:type="dxa" w:w="1988"/>
+            <w:tcBorders>
+              <w:top w:val="single" w:color="BFA999" w:sz="4"/>
+              <w:left w:val="single" w:color="BFA999" w:sz="4"/>
+              <w:bottom w:val="single" w:color="BFA999" w:sz="4"/>
+              <w:right w:val="single" w:color="BFA999" w:sz="4"/>
+            </w:tcBorders>
+            <w:tcMar>
+              <w:top w:type="dxa" w:w="60"/>
+              <w:left w:type="dxa" w:w="100"/>
+              <w:bottom w:type="dxa" w:w="60"/>
+              <w:right w:type="dxa" w:w="100"/>
+            </w:tcMar>
+          </w:tcPr>
+          <w:p>
+            <w:pPr>
+              <w:spacing w:after="0"/>
+            </w:pPr>
+            <w:r>
+              <w:rPr>
+                <w:sz w:val="21"/>
+                <w:szCs w:val="21"/>
+              </w:rPr>
+              <w:t xml:space="preserve">where it hurts, level 3; the eye's drops</w:t>
+            </w:r>
+          </w:p>
+        </w:tc>
+      </w:tr>
+      <w:tr>
+        <w:trPr>
+          <w:cantSplit/>
+          <w:tblHeader w:val="false"/>
+        </w:trPr>
+        <w:tc>
+          <w:tcPr>
+            <w:tcW w:type="dxa" w:w="850"/>
+            <w:tcBorders>
+              <w:top w:val="single" w:color="BFA999" w:sz="4"/>
+              <w:left w:val="single" w:color="BFA999" w:sz="4"/>
+              <w:bottom w:val="single" w:color="BFA999" w:sz="4"/>
+              <w:right w:val="single" w:color="BFA999" w:sz="4"/>
+            </w:tcBorders>
+            <w:tcMar>
+              <w:top w:type="dxa" w:w="60"/>
+              <w:left w:type="dxa" w:w="100"/>
+              <w:bottom w:type="dxa" w:w="60"/>
+              <w:right w:type="dxa" w:w="100"/>
+            </w:tcMar>
+          </w:tcPr>
+          <w:p>
+            <w:pPr>
+              <w:spacing w:after="0"/>
+            </w:pPr>
+            <w:r>
+              <w:rPr>
+                <w:sz w:val="21"/>
+                <w:szCs w:val="21"/>
+              </w:rPr>
+              <w:t xml:space="preserve">E4</w:t>
+            </w:r>
+          </w:p>
+        </w:tc>
+        <w:tc>
+          <w:tcPr>
+            <w:tcW w:type="dxa" w:w="3900"/>
+            <w:tcBorders>
+              <w:top w:val="single" w:color="BFA999" w:sz="4"/>
+              <w:left w:val="single" w:color="BFA999" w:sz="4"/>
+              <w:bottom w:val="single" w:color="BFA999" w:sz="4"/>
+              <w:right w:val="single" w:color="BFA999" w:sz="4"/>
+            </w:tcBorders>
+            <w:tcMar>
+              <w:top w:type="dxa" w:w="60"/>
+              <w:left w:type="dxa" w:w="100"/>
+              <w:bottom w:type="dxa" w:w="60"/>
+              <w:right w:type="dxa" w:w="100"/>
+            </w:tcMar>
+          </w:tcPr>
+          <w:p>
+            <w:pPr>
+              <w:spacing w:after="0"/>
+            </w:pPr>
+            <w:r>
+              <w:rPr>
+                <w:sz w:val="21"/>
+                <w:szCs w:val="21"/>
+              </w:rPr>
+              <w:t xml:space="preserve">My knee.</w:t>
+            </w:r>
+          </w:p>
+        </w:tc>
+        <w:tc>
+          <w:tcPr>
+            <w:tcW w:type="dxa" w:w="2900"/>
+            <w:tcBorders>
+              <w:top w:val="single" w:color="BFA999" w:sz="4"/>
+              <w:left w:val="single" w:color="BFA999" w:sz="4"/>
+              <w:bottom w:val="single" w:color="BFA999" w:sz="4"/>
+              <w:right w:val="single" w:color="BFA999" w:sz="4"/>
+            </w:tcBorders>
+            <w:tcMar>
+              <w:top w:type="dxa" w:w="60"/>
+              <w:left w:type="dxa" w:w="100"/>
+              <w:bottom w:type="dxa" w:w="60"/>
+              <w:right w:type="dxa" w:w="100"/>
+            </w:tcMar>
+          </w:tcPr>
+          <w:p>
+            <w:pPr>
+              <w:spacing w:after="0"/>
+            </w:pPr>
+          </w:p>
+        </w:tc>
+        <w:tc>
+          <w:tcPr>
+            <w:tcW w:type="dxa" w:w="1988"/>
+            <w:tcBorders>
+              <w:top w:val="single" w:color="BFA999" w:sz="4"/>
+              <w:left w:val="single" w:color="BFA999" w:sz="4"/>
+              <w:bottom w:val="single" w:color="BFA999" w:sz="4"/>
+              <w:right w:val="single" w:color="BFA999" w:sz="4"/>
+            </w:tcBorders>
+            <w:tcMar>
+              <w:top w:type="dxa" w:w="60"/>
+              <w:left w:type="dxa" w:w="100"/>
+              <w:bottom w:type="dxa" w:w="60"/>
+              <w:right w:type="dxa" w:w="100"/>
+            </w:tcMar>
+          </w:tcPr>
+          <w:p>
+            <w:pPr>
+              <w:spacing w:after="0"/>
+            </w:pPr>
+            <w:r>
+              <w:rPr>
+                <w:sz w:val="21"/>
+                <w:szCs w:val="21"/>
+              </w:rPr>
+              <w:t xml:space="preserve">naming the sore part</w:t>
+            </w:r>
+          </w:p>
+        </w:tc>
+      </w:tr>
+      <w:tr>
+        <w:trPr>
+          <w:cantSplit/>
+          <w:tblHeader w:val="false"/>
+        </w:trPr>
+        <w:tc>
+          <w:tcPr>
+            <w:tcW w:type="dxa" w:w="850"/>
+            <w:tcBorders>
+              <w:top w:val="single" w:color="BFA999" w:sz="4"/>
+              <w:left w:val="single" w:color="BFA999" w:sz="4"/>
+              <w:bottom w:val="single" w:color="BFA999" w:sz="4"/>
+              <w:right w:val="single" w:color="BFA999" w:sz="4"/>
+            </w:tcBorders>
+            <w:tcMar>
+              <w:top w:type="dxa" w:w="60"/>
+              <w:left w:type="dxa" w:w="100"/>
+              <w:bottom w:type="dxa" w:w="60"/>
+              <w:right w:type="dxa" w:w="100"/>
+            </w:tcMar>
+          </w:tcPr>
+          <w:p>
+            <w:pPr>
+              <w:spacing w:after="0"/>
+            </w:pPr>
+            <w:r>
+              <w:rPr>
+                <w:sz w:val="21"/>
+                <w:szCs w:val="21"/>
+              </w:rPr>
+              <w:t xml:space="preserve">E5</w:t>
+            </w:r>
+          </w:p>
+        </w:tc>
+        <w:tc>
+          <w:tcPr>
+            <w:tcW w:type="dxa" w:w="3900"/>
+            <w:tcBorders>
+              <w:top w:val="single" w:color="BFA999" w:sz="4"/>
+              <w:left w:val="single" w:color="BFA999" w:sz="4"/>
+              <w:bottom w:val="single" w:color="BFA999" w:sz="4"/>
+              <w:right w:val="single" w:color="BFA999" w:sz="4"/>
+            </w:tcBorders>
+            <w:tcMar>
+              <w:top w:type="dxa" w:w="60"/>
+              <w:left w:type="dxa" w:w="100"/>
+              <w:bottom w:type="dxa" w:w="60"/>
+              <w:right w:type="dxa" w:w="100"/>
+            </w:tcMar>
+          </w:tcPr>
+          <w:p>
+            <w:pPr>
+              <w:spacing w:after="0"/>
+            </w:pPr>
+            <w:r>
+              <w:rPr>
+                <w:sz w:val="21"/>
+                <w:szCs w:val="21"/>
+              </w:rPr>
+              <w:t xml:space="preserve">Yes. · No.</w:t>
+            </w:r>
+          </w:p>
+        </w:tc>
+        <w:tc>
+          <w:tcPr>
+            <w:tcW w:type="dxa" w:w="2900"/>
+            <w:tcBorders>
+              <w:top w:val="single" w:color="BFA999" w:sz="4"/>
+              <w:left w:val="single" w:color="BFA999" w:sz="4"/>
+              <w:bottom w:val="single" w:color="BFA999" w:sz="4"/>
+              <w:right w:val="single" w:color="BFA999" w:sz="4"/>
+            </w:tcBorders>
+            <w:tcMar>
+              <w:top w:type="dxa" w:w="60"/>
+              <w:left w:type="dxa" w:w="100"/>
+              <w:bottom w:type="dxa" w:w="60"/>
+              <w:right w:type="dxa" w:w="100"/>
+            </w:tcMar>
+          </w:tcPr>
+          <w:p>
+            <w:pPr>
+              <w:spacing w:after="0"/>
+            </w:pPr>
+            <w:r>
+              <w:rPr>
+                <w:i/>
+                <w:iCs/>
+                <w:sz w:val="21"/>
+                <w:szCs w:val="21"/>
+              </w:rPr>
+              <w:t xml:space="preserve">ha</w:t>
+            </w:r>
+            <w:r>
+              <w:rPr>
+                <w:sz w:val="21"/>
+                <w:szCs w:val="21"/>
+              </w:rPr>
+              <w:t xml:space="preserve"> = yes; </w:t>
+            </w:r>
+            <w:r>
+              <w:rPr>
+                <w:i/>
+                <w:iCs/>
+                <w:sz w:val="21"/>
+                <w:szCs w:val="21"/>
+              </w:rPr>
+              <w:t xml:space="preserve">na</w:t>
+            </w:r>
+            <w:r>
+              <w:rPr>
+                <w:sz w:val="21"/>
+                <w:szCs w:val="21"/>
+              </w:rPr>
+              <w:t xml:space="preserve"> = no</w:t>
+            </w:r>
+          </w:p>
+        </w:tc>
+        <w:tc>
+          <w:tcPr>
+            <w:tcW w:type="dxa" w:w="1988"/>
+            <w:tcBorders>
+              <w:top w:val="single" w:color="BFA999" w:sz="4"/>
+              <w:left w:val="single" w:color="BFA999" w:sz="4"/>
+              <w:bottom w:val="single" w:color="BFA999" w:sz="4"/>
+              <w:right w:val="single" w:color="BFA999" w:sz="4"/>
+            </w:tcBorders>
+            <w:tcMar>
+              <w:top w:type="dxa" w:w="60"/>
+              <w:left w:type="dxa" w:w="100"/>
+              <w:bottom w:type="dxa" w:w="60"/>
+              <w:right w:type="dxa" w:w="100"/>
+            </w:tcMar>
+          </w:tcPr>
+          <w:p>
+            <w:pPr>
+              <w:spacing w:after="0"/>
+            </w:pPr>
+            <w:r>
+              <w:rPr>
+                <w:sz w:val="21"/>
+                <w:szCs w:val="21"/>
+              </w:rPr>
+              <w:t xml:space="preserve">answering "Does it hurt here?"</w:t>
+            </w:r>
+          </w:p>
+        </w:tc>
+      </w:tr>
+      <w:tr>
+        <w:trPr>
+          <w:cantSplit/>
+          <w:tblHeader w:val="false"/>
+        </w:trPr>
+        <w:tc>
+          <w:tcPr>
+            <w:tcW w:type="dxa" w:w="850"/>
+            <w:tcBorders>
+              <w:top w:val="single" w:color="BFA999" w:sz="4"/>
+              <w:left w:val="single" w:color="BFA999" w:sz="4"/>
+              <w:bottom w:val="single" w:color="BFA999" w:sz="4"/>
+              <w:right w:val="single" w:color="BFA999" w:sz="4"/>
+            </w:tcBorders>
+            <w:tcMar>
+              <w:top w:type="dxa" w:w="60"/>
+              <w:left w:type="dxa" w:w="100"/>
+              <w:bottom w:type="dxa" w:w="60"/>
+              <w:right w:type="dxa" w:w="100"/>
+            </w:tcMar>
+          </w:tcPr>
+          <w:p>
+            <w:pPr>
+              <w:spacing w:after="0"/>
+            </w:pPr>
+            <w:r>
+              <w:rPr>
+                <w:sz w:val="21"/>
+                <w:szCs w:val="21"/>
+              </w:rPr>
+              <w:t xml:space="preserve">E6</w:t>
+            </w:r>
+          </w:p>
+        </w:tc>
+        <w:tc>
+          <w:tcPr>
+            <w:tcW w:type="dxa" w:w="3900"/>
+            <w:tcBorders>
+              <w:top w:val="single" w:color="BFA999" w:sz="4"/>
+              <w:left w:val="single" w:color="BFA999" w:sz="4"/>
+              <w:bottom w:val="single" w:color="BFA999" w:sz="4"/>
+              <w:right w:val="single" w:color="BFA999" w:sz="4"/>
+            </w:tcBorders>
+            <w:tcMar>
+              <w:top w:type="dxa" w:w="60"/>
+              <w:left w:type="dxa" w:w="100"/>
+              <w:bottom w:type="dxa" w:w="60"/>
+              <w:right w:type="dxa" w:w="100"/>
+            </w:tcMar>
+          </w:tcPr>
+          <w:p>
+            <w:pPr>
+              <w:spacing w:after="0"/>
+            </w:pPr>
+            <w:r>
+              <w:rPr>
+                <w:sz w:val="21"/>
+                <w:szCs w:val="21"/>
+              </w:rPr>
+              <w:t xml:space="preserve">I don't feel well. · I don't know why.</w:t>
+            </w:r>
+          </w:p>
+        </w:tc>
+        <w:tc>
+          <w:tcPr>
+            <w:tcW w:type="dxa" w:w="2900"/>
+            <w:tcBorders>
+              <w:top w:val="single" w:color="BFA999" w:sz="4"/>
+              <w:left w:val="single" w:color="BFA999" w:sz="4"/>
+              <w:bottom w:val="single" w:color="BFA999" w:sz="4"/>
+              <w:right w:val="single" w:color="BFA999" w:sz="4"/>
+            </w:tcBorders>
+            <w:tcMar>
+              <w:top w:type="dxa" w:w="60"/>
+              <w:left w:type="dxa" w:w="100"/>
+              <w:bottom w:type="dxa" w:w="60"/>
+              <w:right w:type="dxa" w:w="100"/>
+            </w:tcMar>
+          </w:tcPr>
+          <w:p>
+            <w:pPr>
+              <w:spacing w:after="0"/>
+            </w:pPr>
+          </w:p>
+        </w:tc>
+        <w:tc>
+          <w:tcPr>
+            <w:tcW w:type="dxa" w:w="1988"/>
+            <w:tcBorders>
+              <w:top w:val="single" w:color="BFA999" w:sz="4"/>
+              <w:left w:val="single" w:color="BFA999" w:sz="4"/>
+              <w:bottom w:val="single" w:color="BFA999" w:sz="4"/>
+              <w:right w:val="single" w:color="BFA999" w:sz="4"/>
+            </w:tcBorders>
+            <w:tcMar>
+              <w:top w:type="dxa" w:w="60"/>
+              <w:left w:type="dxa" w:w="100"/>
+              <w:bottom w:type="dxa" w:w="60"/>
+              <w:right w:type="dxa" w:w="100"/>
+            </w:tcMar>
+          </w:tcPr>
+          <w:p>
+            <w:pPr>
+              <w:spacing w:after="0"/>
+            </w:pPr>
+            <w:r>
+              <w:rPr>
+                <w:sz w:val="21"/>
+                <w:szCs w:val="21"/>
+              </w:rPr>
+              <w:t xml:space="preserve">the check-up (G112)</w:t>
+            </w:r>
+          </w:p>
+        </w:tc>
+      </w:tr>
+      <w:tr>
+        <w:trPr>
+          <w:cantSplit/>
+          <w:tblHeader w:val="false"/>
+        </w:trPr>
+        <w:tc>
+          <w:tcPr>
+            <w:tcW w:type="dxa" w:w="850"/>
+            <w:tcBorders>
+              <w:top w:val="single" w:color="BFA999" w:sz="4"/>
+              <w:left w:val="single" w:color="BFA999" w:sz="4"/>
+              <w:bottom w:val="single" w:color="BFA999" w:sz="4"/>
+              <w:right w:val="single" w:color="BFA999" w:sz="4"/>
+            </w:tcBorders>
+            <w:tcMar>
+              <w:top w:type="dxa" w:w="60"/>
+              <w:left w:type="dxa" w:w="100"/>
+              <w:bottom w:type="dxa" w:w="60"/>
+              <w:right w:type="dxa" w:w="100"/>
+            </w:tcMar>
+          </w:tcPr>
+          <w:p>
+            <w:pPr>
+              <w:spacing w:after="0"/>
+            </w:pPr>
+            <w:r>
+              <w:rPr>
+                <w:sz w:val="21"/>
+                <w:szCs w:val="21"/>
+              </w:rPr>
+              <w:t xml:space="preserve">E7</w:t>
+            </w:r>
+          </w:p>
+        </w:tc>
+        <w:tc>
+          <w:tcPr>
+            <w:tcW w:type="dxa" w:w="3900"/>
+            <w:tcBorders>
+              <w:top w:val="single" w:color="BFA999" w:sz="4"/>
+              <w:left w:val="single" w:color="BFA999" w:sz="4"/>
+              <w:bottom w:val="single" w:color="BFA999" w:sz="4"/>
+              <w:right w:val="single" w:color="BFA999" w:sz="4"/>
+            </w:tcBorders>
+            <w:tcMar>
+              <w:top w:type="dxa" w:w="60"/>
+              <w:left w:type="dxa" w:w="100"/>
+              <w:bottom w:type="dxa" w:w="60"/>
+              <w:right w:type="dxa" w:w="100"/>
+            </w:tcMar>
+          </w:tcPr>
+          <w:p>
+            <w:pPr>
+              <w:spacing w:after="0"/>
+            </w:pPr>
+            <w:r>
+              <w:rPr>
+                <w:sz w:val="21"/>
+                <w:szCs w:val="21"/>
+              </w:rPr>
+              <w:t xml:space="preserve">I fell over and scraped my arm.</w:t>
+            </w:r>
+          </w:p>
+        </w:tc>
+        <w:tc>
+          <w:tcPr>
+            <w:tcW w:type="dxa" w:w="2900"/>
+            <w:tcBorders>
+              <w:top w:val="single" w:color="BFA999" w:sz="4"/>
+              <w:left w:val="single" w:color="BFA999" w:sz="4"/>
+              <w:bottom w:val="single" w:color="BFA999" w:sz="4"/>
+              <w:right w:val="single" w:color="BFA999" w:sz="4"/>
+            </w:tcBorders>
+            <w:tcMar>
+              <w:top w:type="dxa" w:w="60"/>
+              <w:left w:type="dxa" w:w="100"/>
+              <w:bottom w:type="dxa" w:w="60"/>
+              <w:right w:type="dxa" w:w="100"/>
+            </w:tcMar>
+          </w:tcPr>
+          <w:p>
+            <w:pPr>
+              <w:spacing w:after="0"/>
+            </w:pPr>
+          </w:p>
+        </w:tc>
+        <w:tc>
+          <w:tcPr>
+            <w:tcW w:type="dxa" w:w="1988"/>
+            <w:tcBorders>
+              <w:top w:val="single" w:color="BFA999" w:sz="4"/>
+              <w:left w:val="single" w:color="BFA999" w:sz="4"/>
+              <w:bottom w:val="single" w:color="BFA999" w:sz="4"/>
+              <w:right w:val="single" w:color="BFA999" w:sz="4"/>
+            </w:tcBorders>
+            <w:tcMar>
+              <w:top w:type="dxa" w:w="60"/>
+              <w:left w:type="dxa" w:w="100"/>
+              <w:bottom w:type="dxa" w:w="60"/>
+              <w:right w:type="dxa" w:w="100"/>
+            </w:tcMar>
+          </w:tcPr>
+          <w:p>
+            <w:pPr>
+              <w:spacing w:after="0"/>
+            </w:pPr>
+            <w:r>
+              <w:rPr>
+                <w:sz w:val="21"/>
+                <w:szCs w:val="21"/>
+              </w:rPr>
+              <w:t xml:space="preserve">the scrape, why he's here</w:t>
+            </w:r>
+          </w:p>
+        </w:tc>
+      </w:tr>
+      <w:tr>
+        <w:trPr>
+          <w:cantSplit/>
+          <w:tblHeader w:val="false"/>
+        </w:trPr>
+        <w:tc>
+          <w:tcPr>
+            <w:tcW w:type="dxa" w:w="850"/>
+            <w:tcBorders>
+              <w:top w:val="single" w:color="BFA999" w:sz="4"/>
+              <w:left w:val="single" w:color="BFA999" w:sz="4"/>
+              <w:bottom w:val="single" w:color="BFA999" w:sz="4"/>
+              <w:right w:val="single" w:color="BFA999" w:sz="4"/>
+            </w:tcBorders>
+            <w:tcMar>
+              <w:top w:type="dxa" w:w="60"/>
+              <w:left w:type="dxa" w:w="100"/>
+              <w:bottom w:type="dxa" w:w="60"/>
+              <w:right w:type="dxa" w:w="100"/>
+            </w:tcMar>
+          </w:tcPr>
+          <w:p>
+            <w:pPr>
+              <w:spacing w:after="0"/>
+            </w:pPr>
+            <w:r>
+              <w:rPr>
+                <w:sz w:val="21"/>
+                <w:szCs w:val="21"/>
+              </w:rPr>
+              <w:t xml:space="preserve">E8</w:t>
+            </w:r>
+          </w:p>
+        </w:tc>
+        <w:tc>
+          <w:tcPr>
+            <w:tcW w:type="dxa" w:w="3900"/>
+            <w:tcBorders>
+              <w:top w:val="single" w:color="BFA999" w:sz="4"/>
+              <w:left w:val="single" w:color="BFA999" w:sz="4"/>
+              <w:bottom w:val="single" w:color="BFA999" w:sz="4"/>
+              <w:right w:val="single" w:color="BFA999" w:sz="4"/>
+            </w:tcBorders>
+            <w:tcMar>
+              <w:top w:type="dxa" w:w="60"/>
+              <w:left w:type="dxa" w:w="100"/>
+              <w:bottom w:type="dxa" w:w="60"/>
+              <w:right w:type="dxa" w:w="100"/>
+            </w:tcMar>
+          </w:tcPr>
+          <w:p>
+            <w:pPr>
+              <w:spacing w:after="0"/>
+            </w:pPr>
+            <w:r>
+              <w:rPr>
+                <w:sz w:val="21"/>
+                <w:szCs w:val="21"/>
+              </w:rPr>
+              <w:t xml:space="preserve">My ear feels blocked. · My tooth hurts. · My tongue is sore.</w:t>
+            </w:r>
+          </w:p>
+        </w:tc>
+        <w:tc>
+          <w:tcPr>
+            <w:tcW w:type="dxa" w:w="2900"/>
+            <w:tcBorders>
+              <w:top w:val="single" w:color="BFA999" w:sz="4"/>
+              <w:left w:val="single" w:color="BFA999" w:sz="4"/>
+              <w:bottom w:val="single" w:color="BFA999" w:sz="4"/>
+              <w:right w:val="single" w:color="BFA999" w:sz="4"/>
+            </w:tcBorders>
+            <w:tcMar>
+              <w:top w:type="dxa" w:w="60"/>
+              <w:left w:type="dxa" w:w="100"/>
+              <w:bottom w:type="dxa" w:w="60"/>
+              <w:right w:type="dxa" w:w="100"/>
+            </w:tcMar>
+          </w:tcPr>
+          <w:p>
+            <w:pPr>
+              <w:spacing w:after="0"/>
+            </w:pPr>
+          </w:p>
+        </w:tc>
+        <w:tc>
+          <w:tcPr>
+            <w:tcW w:type="dxa" w:w="1988"/>
+            <w:tcBorders>
+              <w:top w:val="single" w:color="BFA999" w:sz="4"/>
+              <w:left w:val="single" w:color="BFA999" w:sz="4"/>
+              <w:bottom w:val="single" w:color="BFA999" w:sz="4"/>
+              <w:right w:val="single" w:color="BFA999" w:sz="4"/>
+            </w:tcBorders>
+            <w:tcMar>
+              <w:top w:type="dxa" w:w="60"/>
+              <w:left w:type="dxa" w:w="100"/>
+              <w:bottom w:type="dxa" w:w="60"/>
+              <w:right w:type="dxa" w:w="100"/>
+            </w:tcMar>
+          </w:tcPr>
+          <w:p>
+            <w:pPr>
+              <w:spacing w:after="0"/>
+            </w:pPr>
+            <w:r>
+              <w:rPr>
+                <w:sz w:val="21"/>
+                <w:szCs w:val="21"/>
+              </w:rPr>
+              <w:t xml:space="preserve">the ear, the tooth, the drinks: why he's here</w:t>
+            </w:r>
+          </w:p>
+        </w:tc>
+      </w:tr>
+      <w:tr>
+        <w:trPr>
+          <w:cantSplit/>
+          <w:tblHeader w:val="false"/>
+        </w:trPr>
+        <w:tc>
+          <w:tcPr>
+            <w:tcW w:type="dxa" w:w="850"/>
+            <w:tcBorders>
+              <w:top w:val="single" w:color="BFA999" w:sz="4"/>
+              <w:left w:val="single" w:color="BFA999" w:sz="4"/>
+              <w:bottom w:val="single" w:color="BFA999" w:sz="4"/>
+              <w:right w:val="single" w:color="BFA999" w:sz="4"/>
+            </w:tcBorders>
+            <w:tcMar>
+              <w:top w:type="dxa" w:w="60"/>
+              <w:left w:type="dxa" w:w="100"/>
+              <w:bottom w:type="dxa" w:w="60"/>
+              <w:right w:type="dxa" w:w="100"/>
+            </w:tcMar>
+          </w:tcPr>
+          <w:p>
+            <w:pPr>
+              <w:spacing w:after="0"/>
+            </w:pPr>
+            <w:r>
+              <w:rPr>
+                <w:sz w:val="21"/>
+                <w:szCs w:val="21"/>
+              </w:rPr>
+              <w:t xml:space="preserve">E9</w:t>
+            </w:r>
+          </w:p>
+        </w:tc>
+        <w:tc>
+          <w:tcPr>
+            <w:tcW w:type="dxa" w:w="3900"/>
+            <w:tcBorders>
+              <w:top w:val="single" w:color="BFA999" w:sz="4"/>
+              <w:left w:val="single" w:color="BFA999" w:sz="4"/>
+              <w:bottom w:val="single" w:color="BFA999" w:sz="4"/>
+              <w:right w:val="single" w:color="BFA999" w:sz="4"/>
+            </w:tcBorders>
+            <w:tcMar>
+              <w:top w:type="dxa" w:w="60"/>
+              <w:left w:type="dxa" w:w="100"/>
+              <w:bottom w:type="dxa" w:w="60"/>
+              <w:right w:type="dxa" w:w="100"/>
+            </w:tcMar>
+          </w:tcPr>
+          <w:p>
+            <w:pPr>
+              <w:spacing w:after="0"/>
+            </w:pPr>
+            <w:r>
+              <w:rPr>
+                <w:sz w:val="21"/>
+                <w:szCs w:val="21"/>
+              </w:rPr>
+              <w:t xml:space="preserve">I can't see well. · Ow, something's in my foot! · Time for my jab.</w:t>
+            </w:r>
+          </w:p>
+        </w:tc>
+        <w:tc>
+          <w:tcPr>
+            <w:tcW w:type="dxa" w:w="2900"/>
+            <w:tcBorders>
+              <w:top w:val="single" w:color="BFA999" w:sz="4"/>
+              <w:left w:val="single" w:color="BFA999" w:sz="4"/>
+              <w:bottom w:val="single" w:color="BFA999" w:sz="4"/>
+              <w:right w:val="single" w:color="BFA999" w:sz="4"/>
+            </w:tcBorders>
+            <w:tcMar>
+              <w:top w:type="dxa" w:w="60"/>
+              <w:left w:type="dxa" w:w="100"/>
+              <w:bottom w:type="dxa" w:w="60"/>
+              <w:right w:type="dxa" w:w="100"/>
+            </w:tcMar>
+          </w:tcPr>
+          <w:p>
+            <w:pPr>
+              <w:spacing w:after="0"/>
+            </w:pPr>
+          </w:p>
+        </w:tc>
+        <w:tc>
+          <w:tcPr>
+            <w:tcW w:type="dxa" w:w="1988"/>
+            <w:tcBorders>
+              <w:top w:val="single" w:color="BFA999" w:sz="4"/>
+              <w:left w:val="single" w:color="BFA999" w:sz="4"/>
+              <w:bottom w:val="single" w:color="BFA999" w:sz="4"/>
+              <w:right w:val="single" w:color="BFA999" w:sz="4"/>
+            </w:tcBorders>
+            <w:tcMar>
+              <w:top w:type="dxa" w:w="60"/>
+              <w:left w:type="dxa" w:w="100"/>
+              <w:bottom w:type="dxa" w:w="60"/>
+              <w:right w:type="dxa" w:w="100"/>
+            </w:tcMar>
+          </w:tcPr>
+          <w:p>
+            <w:pPr>
+              <w:spacing w:after="0"/>
+            </w:pPr>
+            <w:r>
+              <w:rPr>
+                <w:sz w:val="21"/>
+                <w:szCs w:val="21"/>
+              </w:rPr>
+              <w:t xml:space="preserve">the eye, the foot, the jab: why he's here</w:t>
+            </w:r>
+          </w:p>
+        </w:tc>
+      </w:tr>
+      <w:tr>
+        <w:trPr>
+          <w:cantSplit/>
+          <w:tblHeader w:val="false"/>
+        </w:trPr>
+        <w:tc>
+          <w:tcPr>
+            <w:tcW w:type="dxa" w:w="850"/>
+            <w:tcBorders>
+              <w:top w:val="single" w:color="BFA999" w:sz="4"/>
+              <w:left w:val="single" w:color="BFA999" w:sz="4"/>
+              <w:bottom w:val="single" w:color="BFA999" w:sz="4"/>
+              <w:right w:val="single" w:color="BFA999" w:sz="4"/>
+            </w:tcBorders>
+            <w:tcMar>
+              <w:top w:type="dxa" w:w="60"/>
+              <w:left w:type="dxa" w:w="100"/>
+              <w:bottom w:type="dxa" w:w="60"/>
+              <w:right w:type="dxa" w:w="100"/>
+            </w:tcMar>
+          </w:tcPr>
+          <w:p>
+            <w:pPr>
+              <w:spacing w:after="0"/>
+            </w:pPr>
+            <w:r>
+              <w:rPr>
+                <w:sz w:val="21"/>
+                <w:szCs w:val="21"/>
+              </w:rPr>
+              <w:t xml:space="preserve">E10</w:t>
+            </w:r>
+          </w:p>
+        </w:tc>
+        <w:tc>
+          <w:tcPr>
+            <w:tcW w:type="dxa" w:w="3900"/>
+            <w:tcBorders>
+              <w:top w:val="single" w:color="BFA999" w:sz="4"/>
+              <w:left w:val="single" w:color="BFA999" w:sz="4"/>
+              <w:bottom w:val="single" w:color="BFA999" w:sz="4"/>
+              <w:right w:val="single" w:color="BFA999" w:sz="4"/>
+            </w:tcBorders>
+            <w:tcMar>
+              <w:top w:type="dxa" w:w="60"/>
+              <w:left w:type="dxa" w:w="100"/>
+              <w:bottom w:type="dxa" w:w="60"/>
+              <w:right w:type="dxa" w:w="100"/>
+            </w:tcMar>
+          </w:tcPr>
+          <w:p>
+            <w:pPr>
+              <w:spacing w:after="0"/>
+            </w:pPr>
+            <w:r>
+              <w:rPr>
+                <w:sz w:val="21"/>
+                <w:szCs w:val="21"/>
+              </w:rPr>
+              <w:t xml:space="preserve">I feel hot… no, cold!</w:t>
+            </w:r>
+          </w:p>
+        </w:tc>
+        <w:tc>
+          <w:tcPr>
+            <w:tcW w:type="dxa" w:w="2900"/>
+            <w:tcBorders>
+              <w:top w:val="single" w:color="BFA999" w:sz="4"/>
+              <w:left w:val="single" w:color="BFA999" w:sz="4"/>
+              <w:bottom w:val="single" w:color="BFA999" w:sz="4"/>
+              <w:right w:val="single" w:color="BFA999" w:sz="4"/>
+            </w:tcBorders>
+            <w:tcMar>
+              <w:top w:type="dxa" w:w="60"/>
+              <w:left w:type="dxa" w:w="100"/>
+              <w:bottom w:type="dxa" w:w="60"/>
+              <w:right w:type="dxa" w:w="100"/>
+            </w:tcMar>
+          </w:tcPr>
+          <w:p>
+            <w:pPr>
+              <w:spacing w:after="0"/>
+            </w:pPr>
+          </w:p>
+        </w:tc>
+        <w:tc>
+          <w:tcPr>
+            <w:tcW w:type="dxa" w:w="1988"/>
+            <w:tcBorders>
+              <w:top w:val="single" w:color="BFA999" w:sz="4"/>
+              <w:left w:val="single" w:color="BFA999" w:sz="4"/>
+              <w:bottom w:val="single" w:color="BFA999" w:sz="4"/>
+              <w:right w:val="single" w:color="BFA999" w:sz="4"/>
+            </w:tcBorders>
+            <w:tcMar>
+              <w:top w:type="dxa" w:w="60"/>
+              <w:left w:type="dxa" w:w="100"/>
+              <w:bottom w:type="dxa" w:w="60"/>
+              <w:right w:type="dxa" w:w="100"/>
+            </w:tcMar>
+          </w:tcPr>
+          <w:p>
+            <w:pPr>
+              <w:spacing w:after="0"/>
+            </w:pPr>
+            <w:r>
+              <w:rPr>
+                <w:sz w:val="21"/>
+                <w:szCs w:val="21"/>
+              </w:rPr>
+              <w:t xml:space="preserve">the fever room, why he's here</w:t>
+            </w:r>
+          </w:p>
+        </w:tc>
+      </w:tr>
+      <w:tr>
+        <w:trPr>
+          <w:cantSplit/>
+          <w:tblHeader w:val="false"/>
+        </w:trPr>
+        <w:tc>
+          <w:tcPr>
+            <w:tcW w:type="dxa" w:w="850"/>
+            <w:tcBorders>
+              <w:top w:val="single" w:color="BFA999" w:sz="4"/>
+              <w:left w:val="single" w:color="BFA999" w:sz="4"/>
+              <w:bottom w:val="single" w:color="BFA999" w:sz="4"/>
+              <w:right w:val="single" w:color="BFA999" w:sz="4"/>
+            </w:tcBorders>
+            <w:tcMar>
+              <w:top w:type="dxa" w:w="60"/>
+              <w:left w:type="dxa" w:w="100"/>
+              <w:bottom w:type="dxa" w:w="60"/>
+              <w:right w:type="dxa" w:w="100"/>
+            </w:tcMar>
+          </w:tcPr>
+          <w:p>
+            <w:pPr>
+              <w:spacing w:after="0"/>
+            </w:pPr>
+            <w:r>
+              <w:rPr>
+                <w:sz w:val="21"/>
+                <w:szCs w:val="21"/>
+              </w:rPr>
+              <w:t xml:space="preserve">E11</w:t>
+            </w:r>
+          </w:p>
+        </w:tc>
+        <w:tc>
+          <w:tcPr>
+            <w:tcW w:type="dxa" w:w="3900"/>
+            <w:tcBorders>
+              <w:top w:val="single" w:color="BFA999" w:sz="4"/>
+              <w:left w:val="single" w:color="BFA999" w:sz="4"/>
+              <w:bottom w:val="single" w:color="BFA999" w:sz="4"/>
+              <w:right w:val="single" w:color="BFA999" w:sz="4"/>
+            </w:tcBorders>
+            <w:tcMar>
+              <w:top w:type="dxa" w:w="60"/>
+              <w:left w:type="dxa" w:w="100"/>
+              <w:bottom w:type="dxa" w:w="60"/>
+              <w:right w:type="dxa" w:w="100"/>
+            </w:tcMar>
+          </w:tcPr>
+          <w:p>
+            <w:pPr>
+              <w:spacing w:after="0"/>
+            </w:pPr>
+            <w:r>
+              <w:rPr>
+                <w:sz w:val="21"/>
+                <w:szCs w:val="21"/>
+              </w:rPr>
+              <w:t xml:space="preserve">Too hot! · Still too hot! · Too cold! · Still too cold! · Just right!</w:t>
+            </w:r>
+          </w:p>
+        </w:tc>
+        <w:tc>
+          <w:tcPr>
+            <w:tcW w:type="dxa" w:w="2900"/>
+            <w:tcBorders>
+              <w:top w:val="single" w:color="BFA999" w:sz="4"/>
+              <w:left w:val="single" w:color="BFA999" w:sz="4"/>
+              <w:bottom w:val="single" w:color="BFA999" w:sz="4"/>
+              <w:right w:val="single" w:color="BFA999" w:sz="4"/>
+            </w:tcBorders>
+            <w:tcMar>
+              <w:top w:type="dxa" w:w="60"/>
+              <w:left w:type="dxa" w:w="100"/>
+              <w:bottom w:type="dxa" w:w="60"/>
+              <w:right w:type="dxa" w:w="100"/>
+            </w:tcMar>
+          </w:tcPr>
+          <w:p>
+            <w:pPr>
+              <w:spacing w:after="0"/>
+            </w:pPr>
+            <w:r>
+              <w:rPr>
+                <w:i/>
+                <w:iCs/>
+                <w:sz w:val="21"/>
+                <w:szCs w:val="21"/>
+              </w:rPr>
+              <w:t xml:space="preserve">barabar</w:t>
+            </w:r>
+            <w:r>
+              <w:rPr>
+                <w:sz w:val="21"/>
+                <w:szCs w:val="21"/>
+              </w:rPr>
+              <w:t xml:space="preserve"> = just right</w:t>
+            </w:r>
+          </w:p>
+        </w:tc>
+        <w:tc>
+          <w:tcPr>
+            <w:tcW w:type="dxa" w:w="1988"/>
+            <w:tcBorders>
+              <w:top w:val="single" w:color="BFA999" w:sz="4"/>
+              <w:left w:val="single" w:color="BFA999" w:sz="4"/>
+              <w:bottom w:val="single" w:color="BFA999" w:sz="4"/>
+              <w:right w:val="single" w:color="BFA999" w:sz="4"/>
+            </w:tcBorders>
+            <w:tcMar>
+              <w:top w:type="dxa" w:w="60"/>
+              <w:left w:type="dxa" w:w="100"/>
+              <w:bottom w:type="dxa" w:w="60"/>
+              <w:right w:type="dxa" w:w="100"/>
+            </w:tcMar>
+          </w:tcPr>
+          <w:p>
+            <w:pPr>
+              <w:spacing w:after="0"/>
+            </w:pPr>
+            <w:r>
+              <w:rPr>
+                <w:sz w:val="21"/>
+                <w:szCs w:val="21"/>
+              </w:rPr>
+              <w:t xml:space="preserve">the fever room</w:t>
+            </w:r>
+          </w:p>
+        </w:tc>
+      </w:tr>
+      <w:tr>
+        <w:trPr>
+          <w:cantSplit/>
+          <w:tblHeader w:val="false"/>
+        </w:trPr>
+        <w:tc>
+          <w:tcPr>
+            <w:tcW w:type="dxa" w:w="850"/>
+            <w:tcBorders>
+              <w:top w:val="single" w:color="BFA999" w:sz="4"/>
+              <w:left w:val="single" w:color="BFA999" w:sz="4"/>
+              <w:bottom w:val="single" w:color="BFA999" w:sz="4"/>
+              <w:right w:val="single" w:color="BFA999" w:sz="4"/>
+            </w:tcBorders>
+            <w:tcMar>
+              <w:top w:type="dxa" w:w="60"/>
+              <w:left w:type="dxa" w:w="100"/>
+              <w:bottom w:type="dxa" w:w="60"/>
+              <w:right w:type="dxa" w:w="100"/>
+            </w:tcMar>
+          </w:tcPr>
+          <w:p>
+            <w:pPr>
+              <w:spacing w:after="0"/>
+            </w:pPr>
+            <w:r>
+              <w:rPr>
+                <w:sz w:val="21"/>
+                <w:szCs w:val="21"/>
+              </w:rPr>
+              <w:t xml:space="preserve">E12</w:t>
+            </w:r>
+          </w:p>
+        </w:tc>
+        <w:tc>
+          <w:tcPr>
+            <w:tcW w:type="dxa" w:w="3900"/>
+            <w:tcBorders>
+              <w:top w:val="single" w:color="BFA999" w:sz="4"/>
+              <w:left w:val="single" w:color="BFA999" w:sz="4"/>
+              <w:bottom w:val="single" w:color="BFA999" w:sz="4"/>
+              <w:right w:val="single" w:color="BFA999" w:sz="4"/>
+            </w:tcBorders>
+            <w:tcMar>
+              <w:top w:type="dxa" w:w="60"/>
+              <w:left w:type="dxa" w:w="100"/>
+              <w:bottom w:type="dxa" w:w="60"/>
+              <w:right w:type="dxa" w:w="100"/>
+            </w:tcMar>
+          </w:tcPr>
+          <w:p>
+            <w:pPr>
+              <w:spacing w:after="0"/>
+            </w:pPr>
+            <w:r>
+              <w:rPr>
+                <w:sz w:val="21"/>
+                <w:szCs w:val="21"/>
+              </w:rPr>
+              <w:t xml:space="preserve">Ow! · That tickles!</w:t>
+            </w:r>
+          </w:p>
+        </w:tc>
+        <w:tc>
+          <w:tcPr>
+            <w:tcW w:type="dxa" w:w="2900"/>
+            <w:tcBorders>
+              <w:top w:val="single" w:color="BFA999" w:sz="4"/>
+              <w:left w:val="single" w:color="BFA999" w:sz="4"/>
+              <w:bottom w:val="single" w:color="BFA999" w:sz="4"/>
+              <w:right w:val="single" w:color="BFA999" w:sz="4"/>
+            </w:tcBorders>
+            <w:tcMar>
+              <w:top w:type="dxa" w:w="60"/>
+              <w:left w:type="dxa" w:w="100"/>
+              <w:bottom w:type="dxa" w:w="60"/>
+              <w:right w:type="dxa" w:w="100"/>
+            </w:tcMar>
+          </w:tcPr>
+          <w:p>
+            <w:pPr>
+              <w:spacing w:after="0"/>
+            </w:pPr>
+          </w:p>
+        </w:tc>
+        <w:tc>
+          <w:tcPr>
+            <w:tcW w:type="dxa" w:w="1988"/>
+            <w:tcBorders>
+              <w:top w:val="single" w:color="BFA999" w:sz="4"/>
+              <w:left w:val="single" w:color="BFA999" w:sz="4"/>
+              <w:bottom w:val="single" w:color="BFA999" w:sz="4"/>
+              <w:right w:val="single" w:color="BFA999" w:sz="4"/>
+            </w:tcBorders>
+            <w:tcMar>
+              <w:top w:type="dxa" w:w="60"/>
+              <w:left w:type="dxa" w:w="100"/>
+              <w:bottom w:type="dxa" w:w="60"/>
+              <w:right w:type="dxa" w:w="100"/>
+            </w:tcMar>
+          </w:tcPr>
+          <w:p>
+            <w:pPr>
+              <w:spacing w:after="0"/>
+            </w:pPr>
+            <w:r>
+              <w:rPr>
+                <w:sz w:val="21"/>
+                <w:szCs w:val="21"/>
+              </w:rPr>
+              <w:t xml:space="preserve">heal-game reactions</w:t>
+            </w:r>
+          </w:p>
+        </w:tc>
+      </w:tr>
+      <w:tr>
+        <w:trPr>
+          <w:cantSplit/>
+          <w:tblHeader w:val="false"/>
+        </w:trPr>
+        <w:tc>
+          <w:tcPr>
+            <w:tcW w:type="dxa" w:w="850"/>
+            <w:tcBorders>
+              <w:top w:val="single" w:color="BFA999" w:sz="4"/>
+              <w:left w:val="single" w:color="BFA999" w:sz="4"/>
+              <w:bottom w:val="single" w:color="BFA999" w:sz="4"/>
+              <w:right w:val="single" w:color="BFA999" w:sz="4"/>
+            </w:tcBorders>
+            <w:tcMar>
+              <w:top w:type="dxa" w:w="60"/>
+              <w:left w:type="dxa" w:w="100"/>
+              <w:bottom w:type="dxa" w:w="60"/>
+              <w:right w:type="dxa" w:w="100"/>
+            </w:tcMar>
+          </w:tcPr>
+          <w:p>
+            <w:pPr>
+              <w:spacing w:after="0"/>
+            </w:pPr>
+            <w:r>
+              <w:rPr>
+                <w:sz w:val="21"/>
+                <w:szCs w:val="21"/>
+              </w:rPr>
+              <w:t xml:space="preserve">E13</w:t>
+            </w:r>
+          </w:p>
+        </w:tc>
+        <w:tc>
+          <w:tcPr>
+            <w:tcW w:type="dxa" w:w="3900"/>
+            <w:tcBorders>
+              <w:top w:val="single" w:color="BFA999" w:sz="4"/>
+              <w:left w:val="single" w:color="BFA999" w:sz="4"/>
+              <w:bottom w:val="single" w:color="BFA999" w:sz="4"/>
+              <w:right w:val="single" w:color="BFA999" w:sz="4"/>
+            </w:tcBorders>
+            <w:tcMar>
+              <w:top w:type="dxa" w:w="60"/>
+              <w:left w:type="dxa" w:w="100"/>
+              <w:bottom w:type="dxa" w:w="60"/>
+              <w:right w:type="dxa" w:w="100"/>
+            </w:tcMar>
+          </w:tcPr>
+          <w:p>
+            <w:pPr>
+              <w:spacing w:after="0"/>
+            </w:pPr>
+            <w:r>
+              <w:rPr>
+                <w:sz w:val="21"/>
+                <w:szCs w:val="21"/>
+              </w:rPr>
+              <w:t xml:space="preserve">That feels better! · I can hear again! · I can see! · It doesn't hurt now! · My tongue feels better!</w:t>
+            </w:r>
+          </w:p>
+        </w:tc>
+        <w:tc>
+          <w:tcPr>
+            <w:tcW w:type="dxa" w:w="2900"/>
+            <w:tcBorders>
+              <w:top w:val="single" w:color="BFA999" w:sz="4"/>
+              <w:left w:val="single" w:color="BFA999" w:sz="4"/>
+              <w:bottom w:val="single" w:color="BFA999" w:sz="4"/>
+              <w:right w:val="single" w:color="BFA999" w:sz="4"/>
+            </w:tcBorders>
+            <w:tcMar>
+              <w:top w:type="dxa" w:w="60"/>
+              <w:left w:type="dxa" w:w="100"/>
+              <w:bottom w:type="dxa" w:w="60"/>
+              <w:right w:type="dxa" w:w="100"/>
+            </w:tcMar>
+          </w:tcPr>
+          <w:p>
+            <w:pPr>
+              <w:spacing w:after="0"/>
+            </w:pPr>
+          </w:p>
+        </w:tc>
+        <w:tc>
+          <w:tcPr>
+            <w:tcW w:type="dxa" w:w="1988"/>
+            <w:tcBorders>
+              <w:top w:val="single" w:color="BFA999" w:sz="4"/>
+              <w:left w:val="single" w:color="BFA999" w:sz="4"/>
+              <w:bottom w:val="single" w:color="BFA999" w:sz="4"/>
+              <w:right w:val="single" w:color="BFA999" w:sz="4"/>
+            </w:tcBorders>
+            <w:tcMar>
+              <w:top w:type="dxa" w:w="60"/>
+              <w:left w:type="dxa" w:w="100"/>
+              <w:bottom w:type="dxa" w:w="60"/>
+              <w:right w:type="dxa" w:w="100"/>
+            </w:tcMar>
+          </w:tcPr>
+          <w:p>
+            <w:pPr>
+              <w:spacing w:after="0"/>
+            </w:pPr>
+            <w:r>
+              <w:rPr>
+                <w:sz w:val="21"/>
+                <w:szCs w:val="21"/>
+              </w:rPr>
+              <w:t xml:space="preserve">the end of a heal game</w:t>
+            </w:r>
+          </w:p>
+        </w:tc>
+      </w:tr>
+      <w:tr>
+        <w:trPr>
+          <w:cantSplit/>
+          <w:tblHeader w:val="false"/>
+        </w:trPr>
+        <w:tc>
+          <w:tcPr>
+            <w:tcW w:type="dxa" w:w="850"/>
+            <w:tcBorders>
+              <w:top w:val="single" w:color="BFA999" w:sz="4"/>
+              <w:left w:val="single" w:color="BFA999" w:sz="4"/>
+              <w:bottom w:val="single" w:color="BFA999" w:sz="4"/>
+              <w:right w:val="single" w:color="BFA999" w:sz="4"/>
+            </w:tcBorders>
+            <w:tcMar>
+              <w:top w:type="dxa" w:w="60"/>
+              <w:left w:type="dxa" w:w="100"/>
+              <w:bottom w:type="dxa" w:w="60"/>
+              <w:right w:type="dxa" w:w="100"/>
+            </w:tcMar>
+          </w:tcPr>
+          <w:p>
+            <w:pPr>
+              <w:spacing w:after="0"/>
+            </w:pPr>
+            <w:r>
+              <w:rPr>
+                <w:sz w:val="21"/>
+                <w:szCs w:val="21"/>
+              </w:rPr>
+              <w:t xml:space="preserve">E14</w:t>
+            </w:r>
+          </w:p>
+        </w:tc>
+        <w:tc>
+          <w:tcPr>
+            <w:tcW w:type="dxa" w:w="3900"/>
+            <w:tcBorders>
+              <w:top w:val="single" w:color="BFA999" w:sz="4"/>
+              <w:left w:val="single" w:color="BFA999" w:sz="4"/>
+              <w:bottom w:val="single" w:color="BFA999" w:sz="4"/>
+              <w:right w:val="single" w:color="BFA999" w:sz="4"/>
+            </w:tcBorders>
+            <w:tcMar>
+              <w:top w:type="dxa" w:w="60"/>
+              <w:left w:type="dxa" w:w="100"/>
+              <w:bottom w:type="dxa" w:w="60"/>
+              <w:right w:type="dxa" w:w="100"/>
+            </w:tcMar>
+          </w:tcPr>
+          <w:p>
+            <w:pPr>
+              <w:spacing w:after="0"/>
+            </w:pPr>
+            <w:r>
+              <w:rPr>
+                <w:sz w:val="21"/>
+                <w:szCs w:val="21"/>
+              </w:rPr>
+              <w:t xml:space="preserve">Thank you, I feel better!</w:t>
+            </w:r>
+          </w:p>
+        </w:tc>
+        <w:tc>
+          <w:tcPr>
+            <w:tcW w:type="dxa" w:w="2900"/>
+            <w:tcBorders>
+              <w:top w:val="single" w:color="BFA999" w:sz="4"/>
+              <w:left w:val="single" w:color="BFA999" w:sz="4"/>
+              <w:bottom w:val="single" w:color="BFA999" w:sz="4"/>
+              <w:right w:val="single" w:color="BFA999" w:sz="4"/>
+            </w:tcBorders>
+            <w:tcMar>
+              <w:top w:type="dxa" w:w="60"/>
+              <w:left w:type="dxa" w:w="100"/>
+              <w:bottom w:type="dxa" w:w="60"/>
+              <w:right w:type="dxa" w:w="100"/>
+            </w:tcMar>
+          </w:tcPr>
+          <w:p>
+            <w:pPr>
+              <w:spacing w:after="0"/>
+            </w:pPr>
+            <w:r>
+              <w:rPr>
+                <w:i/>
+                <w:iCs/>
+                <w:sz w:val="21"/>
+                <w:szCs w:val="21"/>
+              </w:rPr>
+              <w:t xml:space="preserve">thank you</w:t>
+            </w:r>
+            <w:r>
+              <w:rPr>
+                <w:sz w:val="21"/>
+                <w:szCs w:val="21"/>
+              </w:rPr>
+              <w:t xml:space="preserve"> (the family says it in English)</w:t>
+            </w:r>
+          </w:p>
+        </w:tc>
+        <w:tc>
+          <w:tcPr>
+            <w:tcW w:type="dxa" w:w="1988"/>
+            <w:tcBorders>
+              <w:top w:val="single" w:color="BFA999" w:sz="4"/>
+              <w:left w:val="single" w:color="BFA999" w:sz="4"/>
+              <w:bottom w:val="single" w:color="BFA999" w:sz="4"/>
+              <w:right w:val="single" w:color="BFA999" w:sz="4"/>
+            </w:tcBorders>
+            <w:tcMar>
+              <w:top w:type="dxa" w:w="60"/>
+              <w:left w:type="dxa" w:w="100"/>
+              <w:bottom w:type="dxa" w:w="60"/>
+              <w:right w:type="dxa" w:w="100"/>
+            </w:tcMar>
+          </w:tcPr>
+          <w:p>
+            <w:pPr>
+              <w:spacing w:after="0"/>
+            </w:pPr>
+            <w:r>
+              <w:rPr>
+                <w:sz w:val="21"/>
+                <w:szCs w:val="21"/>
+              </w:rPr>
+              <w:t xml:space="preserve">after every heal game</w:t>
+            </w:r>
+          </w:p>
+        </w:tc>
+      </w:tr>
+      <w:tr>
+        <w:trPr>
+          <w:cantSplit/>
+          <w:tblHeader w:val="false"/>
+        </w:trPr>
+        <w:tc>
+          <w:tcPr>
+            <w:tcW w:type="dxa" w:w="850"/>
+            <w:tcBorders>
+              <w:top w:val="single" w:color="BFA999" w:sz="4"/>
+              <w:left w:val="single" w:color="BFA999" w:sz="4"/>
+              <w:bottom w:val="single" w:color="BFA999" w:sz="4"/>
+              <w:right w:val="single" w:color="BFA999" w:sz="4"/>
+            </w:tcBorders>
+            <w:tcMar>
+              <w:top w:type="dxa" w:w="60"/>
+              <w:left w:type="dxa" w:w="100"/>
+              <w:bottom w:type="dxa" w:w="60"/>
+              <w:right w:type="dxa" w:w="100"/>
+            </w:tcMar>
+          </w:tcPr>
+          <w:p>
+            <w:pPr>
+              <w:spacing w:after="0"/>
+            </w:pPr>
+            <w:r>
+              <w:rPr>
+                <w:sz w:val="21"/>
+                <w:szCs w:val="21"/>
+              </w:rPr>
+              <w:t xml:space="preserve">E15</w:t>
+            </w:r>
+          </w:p>
+        </w:tc>
+        <w:tc>
+          <w:tcPr>
+            <w:tcW w:type="dxa" w:w="3900"/>
+            <w:tcBorders>
+              <w:top w:val="single" w:color="BFA999" w:sz="4"/>
+              <w:left w:val="single" w:color="BFA999" w:sz="4"/>
+              <w:bottom w:val="single" w:color="BFA999" w:sz="4"/>
+              <w:right w:val="single" w:color="BFA999" w:sz="4"/>
+            </w:tcBorders>
+            <w:tcMar>
+              <w:top w:type="dxa" w:w="60"/>
+              <w:left w:type="dxa" w:w="100"/>
+              <w:bottom w:type="dxa" w:w="60"/>
+              <w:right w:type="dxa" w:w="100"/>
+            </w:tcMar>
+          </w:tcPr>
+          <w:p>
+            <w:pPr>
+              <w:spacing w:after="0"/>
+            </w:pPr>
+            <w:r>
+              <w:rPr>
+                <w:sz w:val="21"/>
+                <w:szCs w:val="21"/>
+              </w:rPr>
+              <w:t xml:space="preserve">I feel happy. · I feel sad. · I feel hot. · I feel cold.</w:t>
+            </w:r>
+          </w:p>
+        </w:tc>
+        <w:tc>
+          <w:tcPr>
+            <w:tcW w:type="dxa" w:w="2900"/>
+            <w:tcBorders>
+              <w:top w:val="single" w:color="BFA999" w:sz="4"/>
+              <w:left w:val="single" w:color="BFA999" w:sz="4"/>
+              <w:bottom w:val="single" w:color="BFA999" w:sz="4"/>
+              <w:right w:val="single" w:color="BFA999" w:sz="4"/>
+            </w:tcBorders>
+            <w:tcMar>
+              <w:top w:type="dxa" w:w="60"/>
+              <w:left w:type="dxa" w:w="100"/>
+              <w:bottom w:type="dxa" w:w="60"/>
+              <w:right w:type="dxa" w:w="100"/>
+            </w:tcMar>
+          </w:tcPr>
+          <w:p>
+            <w:pPr>
+              <w:spacing w:after="0"/>
+            </w:pPr>
+          </w:p>
+        </w:tc>
+        <w:tc>
+          <w:tcPr>
+            <w:tcW w:type="dxa" w:w="1988"/>
+            <w:tcBorders>
+              <w:top w:val="single" w:color="BFA999" w:sz="4"/>
+              <w:left w:val="single" w:color="BFA999" w:sz="4"/>
+              <w:bottom w:val="single" w:color="BFA999" w:sz="4"/>
+              <w:right w:val="single" w:color="BFA999" w:sz="4"/>
+            </w:tcBorders>
+            <w:tcMar>
+              <w:top w:type="dxa" w:w="60"/>
+              <w:left w:type="dxa" w:w="100"/>
+              <w:bottom w:type="dxa" w:w="60"/>
+              <w:right w:type="dxa" w:w="100"/>
+            </w:tcMar>
+          </w:tcPr>
+          <w:p>
+            <w:pPr>
+              <w:spacing w:after="0"/>
+            </w:pPr>
+            <w:r>
+              <w:rPr>
+                <w:sz w:val="21"/>
+                <w:szCs w:val="21"/>
+              </w:rPr>
+              <w:t xml:space="preserve">the send-off</w:t>
+            </w:r>
+          </w:p>
+        </w:tc>
+      </w:tr>
+      <w:tr>
+        <w:trPr>
+          <w:cantSplit/>
+          <w:tblHeader w:val="false"/>
+        </w:trPr>
+        <w:tc>
+          <w:tcPr>
+            <w:tcW w:type="dxa" w:w="850"/>
+            <w:tcBorders>
+              <w:top w:val="single" w:color="BFA999" w:sz="4"/>
+              <w:left w:val="single" w:color="BFA999" w:sz="4"/>
+              <w:bottom w:val="single" w:color="BFA999" w:sz="4"/>
+              <w:right w:val="single" w:color="BFA999" w:sz="4"/>
+            </w:tcBorders>
+            <w:tcMar>
+              <w:top w:type="dxa" w:w="60"/>
+              <w:left w:type="dxa" w:w="100"/>
+              <w:bottom w:type="dxa" w:w="60"/>
+              <w:right w:type="dxa" w:w="100"/>
+            </w:tcMar>
+          </w:tcPr>
+          <w:p>
+            <w:pPr>
+              <w:spacing w:after="0"/>
+            </w:pPr>
+            <w:r>
+              <w:rPr>
+                <w:sz w:val="21"/>
+                <w:szCs w:val="21"/>
+              </w:rPr>
+              <w:t xml:space="preserve">E16</w:t>
+            </w:r>
+          </w:p>
+        </w:tc>
+        <w:tc>
+          <w:tcPr>
+            <w:tcW w:type="dxa" w:w="3900"/>
+            <w:tcBorders>
+              <w:top w:val="single" w:color="BFA999" w:sz="4"/>
+              <w:left w:val="single" w:color="BFA999" w:sz="4"/>
+              <w:bottom w:val="single" w:color="BFA999" w:sz="4"/>
+              <w:right w:val="single" w:color="BFA999" w:sz="4"/>
+            </w:tcBorders>
+            <w:tcMar>
+              <w:top w:type="dxa" w:w="60"/>
+              <w:left w:type="dxa" w:w="100"/>
+              <w:bottom w:type="dxa" w:w="60"/>
+              <w:right w:type="dxa" w:w="100"/>
+            </w:tcMar>
+          </w:tcPr>
+          <w:p>
+            <w:pPr>
+              <w:spacing w:after="0"/>
+            </w:pPr>
+            <w:r>
+              <w:rPr>
+                <w:sz w:val="21"/>
+                <w:szCs w:val="21"/>
+              </w:rPr>
+              <w:t xml:space="preserve">Thank you! · Bye!</w:t>
+            </w:r>
+          </w:p>
+        </w:tc>
+        <w:tc>
+          <w:tcPr>
+            <w:tcW w:type="dxa" w:w="2900"/>
+            <w:tcBorders>
+              <w:top w:val="single" w:color="BFA999" w:sz="4"/>
+              <w:left w:val="single" w:color="BFA999" w:sz="4"/>
+              <w:bottom w:val="single" w:color="BFA999" w:sz="4"/>
+              <w:right w:val="single" w:color="BFA999" w:sz="4"/>
+            </w:tcBorders>
+            <w:tcMar>
+              <w:top w:type="dxa" w:w="60"/>
+              <w:left w:type="dxa" w:w="100"/>
+              <w:bottom w:type="dxa" w:w="60"/>
+              <w:right w:type="dxa" w:w="100"/>
+            </w:tcMar>
+          </w:tcPr>
+          <w:p>
+            <w:pPr>
+              <w:spacing w:after="0"/>
+            </w:pPr>
+            <w:r>
+              <w:rPr>
+                <w:i/>
+                <w:iCs/>
+                <w:sz w:val="21"/>
+                <w:szCs w:val="21"/>
+              </w:rPr>
+              <w:t xml:space="preserve">thank you</w:t>
+            </w:r>
+            <w:r>
+              <w:rPr>
+                <w:sz w:val="21"/>
+                <w:szCs w:val="21"/>
+              </w:rPr>
+              <w:t xml:space="preserve"> (the family says it in English)</w:t>
+            </w:r>
+          </w:p>
+        </w:tc>
+        <w:tc>
+          <w:tcPr>
+            <w:tcW w:type="dxa" w:w="1988"/>
+            <w:tcBorders>
+              <w:top w:val="single" w:color="BFA999" w:sz="4"/>
+              <w:left w:val="single" w:color="BFA999" w:sz="4"/>
+              <w:bottom w:val="single" w:color="BFA999" w:sz="4"/>
+              <w:right w:val="single" w:color="BFA999" w:sz="4"/>
+            </w:tcBorders>
+            <w:tcMar>
+              <w:top w:type="dxa" w:w="60"/>
+              <w:left w:type="dxa" w:w="100"/>
+              <w:bottom w:type="dxa" w:w="60"/>
+              <w:right w:type="dxa" w:w="100"/>
+            </w:tcMar>
+          </w:tcPr>
+          <w:p>
+            <w:pPr>
+              <w:spacing w:after="0"/>
+            </w:pPr>
+            <w:r>
+              <w:rPr>
+                <w:sz w:val="21"/>
+                <w:szCs w:val="21"/>
+              </w:rPr>
+              <w:t xml:space="preserve">the goodbye at the door</w:t>
+            </w:r>
+          </w:p>
+        </w:tc>
+      </w:tr>
+    </w:tbl>
+    <w:p>
+      <w:pPr>
+        <w:spacing w:after="120"/>
+      </w:pPr>
+    </w:p>
+    <w:p>
+      <w:pPr>
+        <w:pBdr>
+          <w:bottom w:val="single" w:color="BFA999" w:sz="6" w:space="1"/>
+        </w:pBdr>
+        <w:spacing w:after="200"/>
+      </w:pPr>
+    </w:p>
+    <w:p>
+      <w:pPr>
+        <w:pStyle w:val="Heading2"/>
+      </w:pPr>
+      <w:r>
         <w:t xml:space="preserve">For Zafar</w:t>
       </w:r>
     </w:p>
@@ -29904,17 +31941,17 @@
         <w:t xml:space="preserve">Count:</w:t>
       </w:r>
       <w:r>
-        <w:t xml:space="preserve"> A 83 · B 63 · C 64 · D 10 · </w:t>
+        <w:t xml:space="preserve"> A 82 · B 63 · C 64 · D 10 · E 16 · </w:t>
       </w:r>
       <w:r>
         <w:rPr>
           <w:b/>
           <w:bCs/>
         </w:rPr>
-        <w:t xml:space="preserve">220 lines</w:t>
+        <w:t xml:space="preserve">235 lines</w:t>
       </w:r>
       <w:r>
-        <w:t xml:space="preserve">. A1–A56 are what a visit says, most of it at every visit (A1, A2–A7, A12, A13, one of A29–A41, A42–A45, A49): record those whole first. If his time is short, do A1–A56, then B, then C, then D.</w:t>
+        <w:t xml:space="preserve">. A1–A55 are what a visit says, most of it at every visit (A1, A2–A7, A12, A13, one of A29–A41, A42–A45, A49): record those whole first. If his time is short, do A1–A55, then B, then C, then E, then D.</w:t>
       </w:r>
     </w:p>
     <w:p>
@@ -29969,7 +32006,59 @@
           <w:b/>
           <w:bCs/>
         </w:rPr>
-        <w:t xml:space="preserve">Not sure these belong:</w:t>
+        <w:t xml:space="preserve">Zafar's answers (13 Oct):</w:t>
+      </w:r>
+      <w:r>
+        <w:t xml:space="preserve"> the old man's lines are section E (patients' lines from the clinic data only); his goodbye cue is now "Say thank you" (A54), and "Say thank you to the doctor" stays in `pipeline.json` for another voice, off his list; "Ask them how they feel" is Nani's line and is off his list; the numbers 1–10 all stay (C44, C45), Mum's word shown only where it's confirmed (</w:t>
+      </w:r>
+      <w:r>
+        <w:rPr>
+          <w:i/>
+          <w:iCs/>
+        </w:rPr>
+        <w:t xml:space="preserve">hakro</w:t>
+      </w:r>
+      <w:r>
+        <w:t xml:space="preserve">, </w:t>
+      </w:r>
+      <w:r>
+        <w:rPr>
+          <w:i/>
+          <w:iCs/>
+        </w:rPr>
+        <w:t xml:space="preserve">ba</w:t>
+      </w:r>
+      <w:r>
+        <w:t xml:space="preserve">, </w:t>
+      </w:r>
+      <w:r>
+        <w:rPr>
+          <w:i/>
+          <w:iCs/>
+        </w:rPr>
+        <w:t xml:space="preserve">trae</w:t>
+      </w:r>
+      <w:r>
+        <w:t xml:space="preserve">, </w:t>
+      </w:r>
+      <w:r>
+        <w:rPr>
+          <w:i/>
+          <w:iCs/>
+        </w:rPr>
+        <w:t xml:space="preserve">char</w:t>
+      </w:r>
+      <w:r>
+        <w:t xml:space="preserve">); two-colour plasters stay, at the harder levels (B5).</w:t>
+      </w:r>
+    </w:p>
+    <w:p>
+      <w:r>
+        <w:rPr>
+          <w:b/>
+          <w:bCs/>
+        </w:rPr>
+        <w:t xml:space="preserve">Still not sure these belong:</w:t>
       </w:r>
     </w:p>
     <w:p>
@@ -29981,69 +32070,6 @@
       </w:pPr>
       <w:r>
         <w:t xml:space="preserve">1.	</w:t>
-      </w:r>
-      <w:r>
-        <w:rPr>
-          <w:b/>
-          <w:bCs/>
-        </w:rPr>
-        <w:t xml:space="preserve">The patients' lines are left out</w:t>
-      </w:r>
-      <w:r>
-        <w:t xml:space="preserve"> (about 45: "My knee hurts", "I don't feel well", the feelings, the heal-game reactions). Decision 66 makes him the older-man voice too, so the old man's lines could be his. Add them?</w:t>
-      </w:r>
-    </w:p>
-    <w:p>
-      <w:pPr>
-        <w:tabs>
-          <w:tab w:val="left" w:pos="567"/>
-        </w:tabs>
-        <w:ind w:left="567" w:hanging="340"/>
-      </w:pPr>
-      <w:r>
-        <w:t xml:space="preserve">2.	</w:t>
-      </w:r>
-      <w:r>
-        <w:rPr>
-          <w:b/>
-          <w:bCs/>
-        </w:rPr>
-        <w:t xml:space="preserve">A55 "Say thank you to the doctor"</w:t>
-      </w:r>
-      <w:r>
-        <w:t xml:space="preserve"> is cued in his own voice (`pipeline.json` goodbyes). Odd from him; maybe "Say thank you".</w:t>
-      </w:r>
-    </w:p>
-    <w:p>
-      <w:pPr>
-        <w:tabs>
-          <w:tab w:val="left" w:pos="567"/>
-        </w:tabs>
-        <w:ind w:left="567" w:hanging="340"/>
-      </w:pPr>
-      <w:r>
-        <w:t xml:space="preserve">3.	</w:t>
-      </w:r>
-      <w:r>
-        <w:rPr>
-          <w:b/>
-          <w:bCs/>
-        </w:rPr>
-        <w:t xml:space="preserve">A53 "Ask them how they feel"</w:t>
-      </w:r>
-      <w:r>
-        <w:t xml:space="preserve">: `pipeline.json` marks it the doctor's; `clinic.md` E4 says Nani whispers it.</w:t>
-      </w:r>
-    </w:p>
-    <w:p>
-      <w:pPr>
-        <w:tabs>
-          <w:tab w:val="left" w:pos="567"/>
-        </w:tabs>
-        <w:ind w:left="567" w:hanging="340"/>
-      </w:pPr>
-      <w:r>
-        <w:t xml:space="preserve">4.	</w:t>
       </w:r>
       <w:r>
         <w:rPr>
@@ -30074,14 +32100,14 @@
         <w:ind w:left="567" w:hanging="340"/>
       </w:pPr>
       <w:r>
-        <w:t xml:space="preserve">5.	</w:t>
+        <w:t xml:space="preserve">2.	</w:t>
       </w:r>
       <w:r>
         <w:rPr>
           <w:b/>
           <w:bCs/>
         </w:rPr>
-        <w:t xml:space="preserve">A57–A83</w:t>
+        <w:t xml:space="preserve">A56–A82</w:t>
       </w:r>
       <w:r>
         <w:t xml:space="preserve"> (Round 4 G94–G127 and the old `data/clinic.json` lines) aren't said by today's game; kept because they give the engine his sentence shapes.</w:t>
@@ -30095,7 +32121,7 @@
         <w:ind w:left="567" w:hanging="340"/>
       </w:pPr>
       <w:r>
-        <w:t xml:space="preserve">6.	</w:t>
+        <w:t xml:space="preserve">3.	</w:t>
       </w:r>
       <w:r>
         <w:rPr>
@@ -30116,7 +32142,7 @@
         <w:ind w:left="567" w:hanging="340"/>
       </w:pPr>
       <w:r>
-        <w:t xml:space="preserve">7.	</w:t>
+        <w:t xml:space="preserve">4.	</w:t>
       </w:r>
       <w:r>
         <w:rPr>
@@ -30126,7 +32152,7 @@
         <w:t xml:space="preserve">The parked games</w:t>
       </w:r>
       <w:r>
-        <w:t xml:space="preserve"> (tummy, hic, hair) are left out; hic has two doctor lines ("Boo!", "Ha ha ha! All gone!").</w:t>
+        <w:t xml:space="preserve"> (tummy, hic, hair) are left out; hic has two doctor lines ("Boo!", "Ha ha ha! All gone!"), and tummy and hair have patient lines.</w:t>
       </w:r>
     </w:p>
     <w:p>
@@ -30137,7 +32163,7 @@
         <w:ind w:left="567" w:hanging="340"/>
       </w:pPr>
       <w:r>
-        <w:t xml:space="preserve">8.	</w:t>
+        <w:t xml:space="preserve">5.	</w:t>
       </w:r>
       <w:r>
         <w:rPr>
@@ -30158,7 +32184,7 @@
         <w:ind w:left="567" w:hanging="340"/>
       </w:pPr>
       <w:r>
-        <w:t xml:space="preserve">9.	</w:t>
+        <w:t xml:space="preserve">6.	</w:t>
       </w:r>
       <w:r>
         <w:rPr>
@@ -30309,30 +32335,17 @@
         <w:ind w:left="567" w:hanging="340"/>
       </w:pPr>
       <w:r>
-        <w:t xml:space="preserve">10.	</w:t>
-      </w:r>
-      <w:r>
-        <w:t xml:space="preserve">**</w:t>
+        <w:t xml:space="preserve">7.	</w:t>
       </w:r>
       <w:r>
         <w:rPr>
-          <w:i/>
-          <w:iCs/>
+          <w:b/>
+          <w:bCs/>
         </w:rPr>
-        <w:t xml:space="preserve">trae</w:t>
+        <w:t xml:space="preserve">`docs/status.md` has no recording protocol</w:t>
       </w:r>
       <w:r>
-        <w:t xml:space="preserve"> and </w:t>
-      </w:r>
-      <w:r>
-        <w:rPr>
-          <w:i/>
-          <w:iCs/>
-        </w:rPr>
-        <w:t xml:space="preserve">char</w:t>
-      </w:r>
-      <w:r>
-        <w:t xml:space="preserve">** are confirmed in the lexicon from Mum's Round 3 sentences, but `status.md` ("For Mum", item 1) still lists them as never confirmed. They're shown here.</w:t>
+        <w:t xml:space="preserve">; the intro uses the Round 4 and 5 "How to answer" steps, changed to "twice", and the tested set-up (decision 66, rule G17).</w:t>
       </w:r>
     </w:p>
     <w:p>
@@ -30343,17 +32356,17 @@
         <w:ind w:left="567" w:hanging="340"/>
       </w:pPr>
       <w:r>
-        <w:t xml:space="preserve">11.	</w:t>
+        <w:t xml:space="preserve">8.	</w:t>
       </w:r>
       <w:r>
         <w:rPr>
           <w:b/>
           <w:bCs/>
         </w:rPr>
-        <w:t xml:space="preserve">`docs/status.md` has no recording protocol</w:t>
+        <w:t xml:space="preserve">Section E</w:t>
       </w:r>
       <w:r>
-        <w:t xml:space="preserve">; the intro uses the Round 4 and 5 "How to answer" steps, changed to "twice", and the tested set-up (decision 66, rule G17).</w:t>
+        <w:t xml:space="preserve"> gives the old man every patient line the nine heal games use; the other patients (the girl, the boy, the women) still need their own voices.</w:t>
       </w:r>
     </w:p>
     <w:sectPr>

</xml_diff>